<commit_message>
Acessibilidade e Equidade na Educação com IA - Ensino Einstein (09/2026)
</commit_message>
<xml_diff>
--- a/cv_2025.docx
+++ b/cv_2025.docx
@@ -41,74 +41,88 @@
         <w:jc w:val="center"/>
         <w:rPr>
           <w:b/>
-          <w:sz w:val="36"/>
-          <w:szCs w:val="36"/>
-        </w:rPr>
-      </w:pPr>
-    </w:p>
-    <w:p>
-      <w:pPr>
-        <w:jc w:val="center"/>
-        <w:rPr>
-          <w:bCs/>
           <w:sz w:val="20"/>
           <w:szCs w:val="20"/>
         </w:rPr>
       </w:pPr>
-      <w:r>
-        <w:rPr>
-          <w:bCs/>
-          <w:sz w:val="20"/>
-          <w:szCs w:val="20"/>
+    </w:p>
+    <w:p>
+      <w:pPr>
+        <w:jc w:val="center"/>
+        <w:rPr>
+          <w:bCs/>
+          <w:sz w:val="18"/>
+          <w:szCs w:val="18"/>
+        </w:rPr>
+      </w:pPr>
+      <w:r>
+        <w:rPr>
+          <w:bCs/>
+          <w:sz w:val="18"/>
+          <w:szCs w:val="18"/>
         </w:rPr>
         <w:t xml:space="preserve">Vila Romana, São Paulo – SP | 5511959473402 | </w:t>
       </w:r>
+      <w:r>
+        <w:rPr>
+          <w:sz w:val="18"/>
+          <w:szCs w:val="18"/>
+        </w:rPr>
+        <w:fldChar w:fldCharType="begin"/>
+      </w:r>
+      <w:r>
+        <w:rPr>
+          <w:sz w:val="18"/>
+          <w:szCs w:val="18"/>
+        </w:rPr>
+        <w:instrText>HYPERLINK "mailto:minoruyamanaka@icloud.com"</w:instrText>
+      </w:r>
+      <w:r>
+        <w:rPr>
+          <w:sz w:val="18"/>
+          <w:szCs w:val="18"/>
+        </w:rPr>
+      </w:r>
+      <w:r>
+        <w:rPr>
+          <w:sz w:val="18"/>
+          <w:szCs w:val="18"/>
+        </w:rPr>
+        <w:fldChar w:fldCharType="separate"/>
+      </w:r>
+      <w:r>
+        <w:rPr>
+          <w:rStyle w:val="Hyperlink"/>
+          <w:bCs/>
+          <w:sz w:val="18"/>
+          <w:szCs w:val="18"/>
+        </w:rPr>
+        <w:t>minoruyamanaka@icloud.com</w:t>
+      </w:r>
+      <w:r>
+        <w:rPr>
+          <w:sz w:val="18"/>
+          <w:szCs w:val="18"/>
+        </w:rPr>
+        <w:fldChar w:fldCharType="end"/>
+      </w:r>
+    </w:p>
+    <w:p>
+      <w:pPr>
+        <w:jc w:val="center"/>
+        <w:rPr>
+          <w:bCs/>
+          <w:sz w:val="18"/>
+          <w:szCs w:val="18"/>
+        </w:rPr>
+      </w:pPr>
       <w:hyperlink r:id="rId8" w:history="1">
         <w:r>
           <w:rPr>
             <w:rStyle w:val="Hyperlink"/>
             <w:bCs/>
-            <w:sz w:val="20"/>
-            <w:szCs w:val="20"/>
-          </w:rPr>
-          <w:t>minoruyamanaka@icloud.com</w:t>
-        </w:r>
-      </w:hyperlink>
-    </w:p>
-    <w:p>
-      <w:pPr>
-        <w:jc w:val="center"/>
-        <w:rPr>
-          <w:bCs/>
-          <w:sz w:val="20"/>
-          <w:szCs w:val="20"/>
-        </w:rPr>
-      </w:pPr>
-      <w:r>
-        <w:rPr>
-          <w:bCs/>
-          <w:sz w:val="20"/>
-          <w:szCs w:val="20"/>
-        </w:rPr>
-        <w:t>Aceito proposta para trabalhar como CLT ou PJ – Presencial e Home Office</w:t>
-      </w:r>
-    </w:p>
-    <w:p>
-      <w:pPr>
-        <w:jc w:val="center"/>
-        <w:rPr>
-          <w:bCs/>
-          <w:sz w:val="20"/>
-          <w:szCs w:val="20"/>
-        </w:rPr>
-      </w:pPr>
-      <w:hyperlink r:id="rId9" w:history="1">
-        <w:r>
-          <w:rPr>
-            <w:rStyle w:val="Hyperlink"/>
-            <w:bCs/>
-            <w:sz w:val="20"/>
-            <w:szCs w:val="20"/>
+            <w:sz w:val="18"/>
+            <w:szCs w:val="18"/>
           </w:rPr>
           <w:t>https://github.com/minoru-yamanaka</w:t>
         </w:r>
@@ -116,30 +130,62 @@
       <w:r>
         <w:rPr>
           <w:bCs/>
-          <w:sz w:val="20"/>
-          <w:szCs w:val="20"/>
+          <w:sz w:val="18"/>
+          <w:szCs w:val="18"/>
         </w:rPr>
         <w:t xml:space="preserve"> | </w:t>
       </w:r>
-      <w:hyperlink r:id="rId10" w:history="1">
-        <w:r>
-          <w:rPr>
-            <w:rStyle w:val="Hyperlink"/>
-            <w:bCs/>
-            <w:sz w:val="20"/>
-            <w:szCs w:val="20"/>
-          </w:rPr>
-          <w:t>linkedin.com/in/minoru-yamanaka</w:t>
-        </w:r>
-      </w:hyperlink>
+      <w:r>
+        <w:rPr>
+          <w:sz w:val="18"/>
+          <w:szCs w:val="18"/>
+        </w:rPr>
+        <w:fldChar w:fldCharType="begin"/>
+      </w:r>
+      <w:r>
+        <w:rPr>
+          <w:sz w:val="18"/>
+          <w:szCs w:val="18"/>
+        </w:rPr>
+        <w:instrText>HYPERLINK "https://www.linkedin.com/in/minoru-yamanaka"</w:instrText>
+      </w:r>
+      <w:r>
+        <w:rPr>
+          <w:sz w:val="18"/>
+          <w:szCs w:val="18"/>
+        </w:rPr>
+      </w:r>
+      <w:r>
+        <w:rPr>
+          <w:sz w:val="18"/>
+          <w:szCs w:val="18"/>
+        </w:rPr>
+        <w:fldChar w:fldCharType="separate"/>
+      </w:r>
+      <w:r>
+        <w:rPr>
+          <w:rStyle w:val="Hyperlink"/>
+          <w:bCs/>
+          <w:sz w:val="18"/>
+          <w:szCs w:val="18"/>
+        </w:rPr>
+        <w:t>linkedin.com/in/minoru-yamanaka</w:t>
+      </w:r>
+      <w:r>
+        <w:rPr>
+          <w:sz w:val="18"/>
+          <w:szCs w:val="18"/>
+        </w:rPr>
+        <w:fldChar w:fldCharType="end"/>
+      </w:r>
     </w:p>
     <w:p>
       <w:pPr>
         <w:jc w:val="center"/>
         <w:rPr>
           <w:b/>
-          <w:sz w:val="36"/>
-          <w:szCs w:val="36"/>
+          <w:sz w:val="18"/>
+          <w:szCs w:val="18"/>
         </w:rPr>
       </w:pPr>
     </w:p>
@@ -148,15 +194,15 @@
         <w:jc w:val="center"/>
         <w:rPr>
           <w:bCs/>
-          <w:sz w:val="20"/>
-          <w:szCs w:val="20"/>
-        </w:rPr>
-      </w:pPr>
-      <w:r>
-        <w:rPr>
-          <w:bCs/>
-          <w:sz w:val="20"/>
-          <w:szCs w:val="20"/>
+          <w:sz w:val="18"/>
+          <w:szCs w:val="18"/>
+        </w:rPr>
+      </w:pPr>
+      <w:r>
+        <w:rPr>
+          <w:bCs/>
+          <w:sz w:val="18"/>
+          <w:szCs w:val="18"/>
         </w:rPr>
         <w:t>WebDeveloper | Front-End Developer | Data Analyst | PMO - Gestão de Projetos |</w:t>
       </w:r>
@@ -169,63 +215,63 @@
         </w:tabs>
         <w:rPr>
           <w:bCs/>
-          <w:sz w:val="20"/>
-          <w:szCs w:val="20"/>
-        </w:rPr>
-      </w:pPr>
-      <w:r>
-        <w:rPr>
-          <w:bCs/>
-          <w:sz w:val="20"/>
-          <w:szCs w:val="20"/>
+          <w:sz w:val="18"/>
+          <w:szCs w:val="18"/>
+        </w:rPr>
+      </w:pPr>
+      <w:r>
+        <w:rPr>
+          <w:bCs/>
+          <w:sz w:val="18"/>
+          <w:szCs w:val="18"/>
         </w:rPr>
         <w:tab/>
       </w:r>
       <w:r>
         <w:rPr>
           <w:bCs/>
-          <w:sz w:val="20"/>
-          <w:szCs w:val="20"/>
+          <w:sz w:val="18"/>
+          <w:szCs w:val="18"/>
         </w:rPr>
         <w:t>Tech Recru</w:t>
       </w:r>
       <w:r>
         <w:rPr>
           <w:bCs/>
-          <w:sz w:val="20"/>
-          <w:szCs w:val="20"/>
+          <w:sz w:val="18"/>
+          <w:szCs w:val="18"/>
         </w:rPr>
         <w:t>i</w:t>
       </w:r>
       <w:r>
         <w:rPr>
           <w:bCs/>
-          <w:sz w:val="20"/>
-          <w:szCs w:val="20"/>
+          <w:sz w:val="18"/>
+          <w:szCs w:val="18"/>
         </w:rPr>
         <w:t xml:space="preserve">ter - </w:t>
       </w:r>
       <w:r>
         <w:rPr>
           <w:bCs/>
-          <w:sz w:val="20"/>
-          <w:szCs w:val="20"/>
+          <w:sz w:val="18"/>
+          <w:szCs w:val="18"/>
         </w:rPr>
         <w:t>R</w:t>
       </w:r>
       <w:r>
         <w:rPr>
           <w:bCs/>
-          <w:sz w:val="20"/>
-          <w:szCs w:val="20"/>
+          <w:sz w:val="18"/>
+          <w:szCs w:val="18"/>
         </w:rPr>
         <w:t>ecrutador de TI</w:t>
       </w:r>
       <w:r>
         <w:rPr>
           <w:bCs/>
-          <w:sz w:val="20"/>
-          <w:szCs w:val="20"/>
+          <w:sz w:val="18"/>
+          <w:szCs w:val="18"/>
         </w:rPr>
         <w:t xml:space="preserve"> | Data Science &amp; Ed Tech</w:t>
       </w:r>
@@ -244,8 +290,8 @@
         <w:rPr>
           <w:b/>
           <w:color w:val="000000"/>
-          <w:sz w:val="20"/>
-          <w:szCs w:val="20"/>
+          <w:sz w:val="18"/>
+          <w:szCs w:val="18"/>
         </w:rPr>
       </w:pPr>
     </w:p>
@@ -263,16 +309,16 @@
         <w:rPr>
           <w:b/>
           <w:color w:val="000000"/>
-          <w:sz w:val="20"/>
-          <w:szCs w:val="20"/>
+          <w:sz w:val="18"/>
+          <w:szCs w:val="18"/>
         </w:rPr>
       </w:pPr>
       <w:r>
         <w:rPr>
           <w:b/>
           <w:color w:val="000000"/>
-          <w:sz w:val="20"/>
-          <w:szCs w:val="20"/>
+          <w:sz w:val="18"/>
+          <w:szCs w:val="18"/>
         </w:rPr>
         <w:t>RESUMO PROFISSIONAL</w:t>
       </w:r>
@@ -290,8 +336,8 @@
         <w:jc w:val="both"/>
         <w:rPr>
           <w:color w:val="000000"/>
-          <w:sz w:val="20"/>
-          <w:szCs w:val="20"/>
+          <w:sz w:val="18"/>
+          <w:szCs w:val="18"/>
         </w:rPr>
       </w:pPr>
     </w:p>
@@ -300,16 +346,16 @@
         <w:jc w:val="both"/>
         <w:rPr>
           <w:color w:val="000000"/>
-          <w:sz w:val="20"/>
-          <w:szCs w:val="20"/>
+          <w:sz w:val="18"/>
+          <w:szCs w:val="18"/>
           <w:lang w:val="pt-BR"/>
         </w:rPr>
       </w:pPr>
       <w:r>
         <w:rPr>
           <w:color w:val="000000"/>
-          <w:sz w:val="20"/>
-          <w:szCs w:val="20"/>
+          <w:sz w:val="18"/>
+          <w:szCs w:val="18"/>
           <w:lang w:val="pt-BR"/>
         </w:rPr>
         <w:t xml:space="preserve">Cientista de Dados e Analista de Sistemas, com formação em ADS e Especialização Técnica em Informática para Internet. Minha trajetória é marcada pela convergência entre tecnologia, inovação e gestão, com sólida experiência em transformar dados brutos em inteligência estratégica. Atualmente, lidero a frente de </w:t>
@@ -319,19 +365,43 @@
           <w:b/>
           <w:bCs/>
           <w:color w:val="000000"/>
-          <w:sz w:val="20"/>
-          <w:szCs w:val="20"/>
+          <w:sz w:val="18"/>
+          <w:szCs w:val="18"/>
           <w:lang w:val="pt-BR"/>
         </w:rPr>
-        <w:t>Business Intelligence (BI)</w:t>
-      </w:r>
-      <w:r>
-        <w:rPr>
+        <w:t xml:space="preserve">Business </w:t>
+      </w:r>
+      <w:proofErr w:type="spellStart"/>
+      <w:r>
+        <w:rPr>
+          <w:b/>
+          <w:bCs/>
           <w:color w:val="000000"/>
-          <w:sz w:val="20"/>
-          <w:szCs w:val="20"/>
+          <w:sz w:val="18"/>
+          <w:szCs w:val="18"/>
           <w:lang w:val="pt-BR"/>
         </w:rPr>
+        <w:t>Intelligence</w:t>
+      </w:r>
+      <w:proofErr w:type="spellEnd"/>
+      <w:r>
+        <w:rPr>
+          <w:b/>
+          <w:bCs/>
+          <w:color w:val="000000"/>
+          <w:sz w:val="18"/>
+          <w:szCs w:val="18"/>
+          <w:lang w:val="pt-BR"/>
+        </w:rPr>
+        <w:t xml:space="preserve"> (BI)</w:t>
+      </w:r>
+      <w:r>
+        <w:rPr>
+          <w:color w:val="000000"/>
+          <w:sz w:val="18"/>
+          <w:szCs w:val="18"/>
+          <w:lang w:val="pt-BR"/>
+        </w:rPr>
         <w:t xml:space="preserve"> para o curso de Medicina do Mackenzie, onde estruturei indicadores de desempenho e metodologias ativas, estabelecendo um novo modelo de gestão baseada em dados na unidade Alphaville.</w:t>
       </w:r>
     </w:p>
@@ -340,16 +410,16 @@
         <w:jc w:val="both"/>
         <w:rPr>
           <w:color w:val="000000"/>
-          <w:sz w:val="20"/>
-          <w:szCs w:val="20"/>
+          <w:sz w:val="18"/>
+          <w:szCs w:val="18"/>
           <w:lang w:val="pt-BR"/>
         </w:rPr>
       </w:pPr>
       <w:r>
         <w:rPr>
           <w:color w:val="000000"/>
-          <w:sz w:val="20"/>
-          <w:szCs w:val="20"/>
+          <w:sz w:val="18"/>
+          <w:szCs w:val="18"/>
           <w:lang w:val="pt-BR"/>
         </w:rPr>
         <w:t xml:space="preserve">Possuo domínio técnico em linguagens como </w:t>
@@ -359,8 +429,8 @@
           <w:b/>
           <w:bCs/>
           <w:color w:val="000000"/>
-          <w:sz w:val="20"/>
-          <w:szCs w:val="20"/>
+          <w:sz w:val="18"/>
+          <w:szCs w:val="18"/>
           <w:lang w:val="pt-BR"/>
         </w:rPr>
         <w:t>Java, Python e SQL</w:t>
@@ -368,8 +438,8 @@
       <w:r>
         <w:rPr>
           <w:color w:val="000000"/>
-          <w:sz w:val="20"/>
-          <w:szCs w:val="20"/>
+          <w:sz w:val="18"/>
+          <w:szCs w:val="18"/>
           <w:lang w:val="pt-BR"/>
         </w:rPr>
         <w:t xml:space="preserve">, além de sólido conhecimento em desenvolvimento </w:t>
@@ -379,8 +449,8 @@
           <w:b/>
           <w:bCs/>
           <w:color w:val="000000"/>
-          <w:sz w:val="20"/>
-          <w:szCs w:val="20"/>
+          <w:sz w:val="18"/>
+          <w:szCs w:val="18"/>
           <w:lang w:val="pt-BR"/>
         </w:rPr>
         <w:t>WEB</w:t>
@@ -388,8 +458,8 @@
       <w:r>
         <w:rPr>
           <w:color w:val="000000"/>
-          <w:sz w:val="20"/>
-          <w:szCs w:val="20"/>
+          <w:sz w:val="18"/>
+          <w:szCs w:val="18"/>
           <w:lang w:val="pt-BR"/>
         </w:rPr>
         <w:t xml:space="preserve"> e ferramentas de análise como </w:t>
@@ -399,8 +469,8 @@
           <w:b/>
           <w:bCs/>
           <w:color w:val="000000"/>
-          <w:sz w:val="20"/>
-          <w:szCs w:val="20"/>
+          <w:sz w:val="18"/>
+          <w:szCs w:val="18"/>
           <w:lang w:val="pt-BR"/>
         </w:rPr>
         <w:t>Power BI</w:t>
@@ -408,29 +478,49 @@
       <w:r>
         <w:rPr>
           <w:color w:val="000000"/>
-          <w:sz w:val="20"/>
-          <w:szCs w:val="20"/>
+          <w:sz w:val="18"/>
+          <w:szCs w:val="18"/>
           <w:lang w:val="pt-BR"/>
         </w:rPr>
-        <w:t>. Minha bagagem inclui a docência em tecnologia no SENAC SP, o que consolidou minhas habilidades de liderança e comunicação, facilitando a interação entre equipes multidisciplinares sob metodologias ágeis (Scrum/Kanban).</w:t>
-      </w:r>
-    </w:p>
-    <w:p>
-      <w:pPr>
-        <w:jc w:val="both"/>
-        <w:rPr>
-          <w:b/>
-          <w:bCs/>
-          <w:sz w:val="20"/>
-          <w:szCs w:val="20"/>
-        </w:rPr>
-      </w:pPr>
-      <w:r>
-        <w:rPr>
-          <w:b/>
-          <w:bCs/>
-          <w:sz w:val="20"/>
-          <w:szCs w:val="20"/>
+        <w:t>. Minha bagagem inclui a docência em tecnologia no SENAC SP, o que consolidou minhas habilidades de liderança e comunicação, facilitando a interação entre equipes multidisciplinares sob metodologias ágeis (Scrum/</w:t>
+      </w:r>
+      <w:proofErr w:type="spellStart"/>
+      <w:r>
+        <w:rPr>
+          <w:color w:val="000000"/>
+          <w:sz w:val="18"/>
+          <w:szCs w:val="18"/>
+          <w:lang w:val="pt-BR"/>
+        </w:rPr>
+        <w:t>Kanban</w:t>
+      </w:r>
+      <w:proofErr w:type="spellEnd"/>
+      <w:r>
+        <w:rPr>
+          <w:color w:val="000000"/>
+          <w:sz w:val="18"/>
+          <w:szCs w:val="18"/>
+          <w:lang w:val="pt-BR"/>
+        </w:rPr>
+        <w:t>).</w:t>
+      </w:r>
+    </w:p>
+    <w:p>
+      <w:pPr>
+        <w:jc w:val="both"/>
+        <w:rPr>
+          <w:b/>
+          <w:bCs/>
+          <w:sz w:val="18"/>
+          <w:szCs w:val="18"/>
+        </w:rPr>
+      </w:pPr>
+      <w:r>
+        <w:rPr>
+          <w:b/>
+          <w:bCs/>
+          <w:sz w:val="18"/>
+          <w:szCs w:val="18"/>
         </w:rPr>
         <w:t>Contribuí com alguns resultados para as empresas:</w:t>
       </w:r>
@@ -444,64 +534,57 @@
         </w:numPr>
         <w:jc w:val="both"/>
         <w:rPr>
-          <w:sz w:val="20"/>
-          <w:szCs w:val="20"/>
-        </w:rPr>
-      </w:pPr>
-      <w:r>
-        <w:rPr>
-          <w:sz w:val="20"/>
-          <w:szCs w:val="20"/>
+          <w:sz w:val="18"/>
+          <w:szCs w:val="18"/>
+        </w:rPr>
+      </w:pPr>
+      <w:r>
+        <w:rPr>
+          <w:sz w:val="18"/>
+          <w:szCs w:val="18"/>
+        </w:rPr>
+        <w:t xml:space="preserve">Como Cientista de Dados, liderei o desenvolvimento e a implantação do sistema de avaliação para o </w:t>
+      </w:r>
+      <w:r>
+        <w:rPr>
+          <w:b/>
+          <w:bCs/>
+          <w:sz w:val="18"/>
+          <w:szCs w:val="18"/>
+        </w:rPr>
+        <w:t>P</w:t>
+      </w:r>
+      <w:r>
+        <w:rPr>
+          <w:b/>
+          <w:bCs/>
+          <w:sz w:val="18"/>
+          <w:szCs w:val="18"/>
+        </w:rPr>
+        <w:t xml:space="preserve">rimeiro </w:t>
+      </w:r>
+      <w:r>
+        <w:rPr>
+          <w:b/>
+          <w:bCs/>
+          <w:sz w:val="18"/>
+          <w:szCs w:val="18"/>
         </w:rPr>
         <w:t>C</w:t>
       </w:r>
       <w:r>
         <w:rPr>
-          <w:sz w:val="20"/>
-          <w:szCs w:val="20"/>
-        </w:rPr>
-        <w:t xml:space="preserve">omo Cientista de Dados, liderei o desenvolvimento e a implantação do sistema de avaliação para o </w:t>
-      </w:r>
-      <w:r>
-        <w:rPr>
-          <w:b/>
-          <w:bCs/>
-          <w:sz w:val="20"/>
-          <w:szCs w:val="20"/>
-        </w:rPr>
-        <w:t>P</w:t>
-      </w:r>
-      <w:r>
-        <w:rPr>
-          <w:b/>
-          <w:bCs/>
-          <w:sz w:val="20"/>
-          <w:szCs w:val="20"/>
-        </w:rPr>
-        <w:t xml:space="preserve">rimeiro </w:t>
-      </w:r>
-      <w:r>
-        <w:rPr>
-          <w:b/>
-          <w:bCs/>
-          <w:sz w:val="20"/>
-          <w:szCs w:val="20"/>
-        </w:rPr>
-        <w:t>C</w:t>
-      </w:r>
-      <w:r>
-        <w:rPr>
-          <w:b/>
-          <w:bCs/>
-          <w:sz w:val="20"/>
-          <w:szCs w:val="20"/>
+          <w:b/>
+          <w:bCs/>
+          <w:sz w:val="18"/>
+          <w:szCs w:val="18"/>
         </w:rPr>
         <w:t>urso de Medicina do Mackenzie em São Paulo.</w:t>
       </w:r>
       <w:r>
         <w:rPr>
-          <w:sz w:val="20"/>
-          <w:szCs w:val="20"/>
+          <w:sz w:val="18"/>
+          <w:szCs w:val="18"/>
         </w:rPr>
         <w:t xml:space="preserve"> Através de soluções de </w:t>
       </w:r>
@@ -509,15 +592,15 @@
         <w:rPr>
           <w:b/>
           <w:bCs/>
-          <w:sz w:val="20"/>
-          <w:szCs w:val="20"/>
+          <w:sz w:val="18"/>
+          <w:szCs w:val="18"/>
         </w:rPr>
         <w:t>Business Intelligence (BI)</w:t>
       </w:r>
       <w:r>
         <w:rPr>
-          <w:sz w:val="20"/>
-          <w:szCs w:val="20"/>
+          <w:sz w:val="18"/>
+          <w:szCs w:val="18"/>
         </w:rPr>
         <w:t>, estruturei indicadores de desempenho acadêmico e metodologias ativas, transformando dados brutos em inteligência estratégica para a coordenação e estabelecendo um modelo de gestão baseada em dados na unidade Alphaville.</w:t>
       </w:r>
@@ -531,14 +614,14 @@
         </w:numPr>
         <w:jc w:val="both"/>
         <w:rPr>
-          <w:sz w:val="20"/>
-          <w:szCs w:val="20"/>
-        </w:rPr>
-      </w:pPr>
-      <w:r>
-        <w:rPr>
-          <w:sz w:val="20"/>
-          <w:szCs w:val="20"/>
+          <w:sz w:val="18"/>
+          <w:szCs w:val="18"/>
+        </w:rPr>
+      </w:pPr>
+      <w:r>
+        <w:rPr>
+          <w:sz w:val="18"/>
+          <w:szCs w:val="18"/>
         </w:rPr>
         <w:t xml:space="preserve">No </w:t>
       </w:r>
@@ -546,8 +629,8 @@
         <w:rPr>
           <w:b/>
           <w:bCs/>
-          <w:sz w:val="20"/>
-          <w:szCs w:val="20"/>
+          <w:sz w:val="18"/>
+          <w:szCs w:val="18"/>
         </w:rPr>
         <w:t xml:space="preserve">Senac </w:t>
       </w:r>
@@ -555,22 +638,22 @@
         <w:rPr>
           <w:b/>
           <w:bCs/>
-          <w:sz w:val="20"/>
-          <w:szCs w:val="20"/>
+          <w:sz w:val="18"/>
+          <w:szCs w:val="18"/>
         </w:rPr>
         <w:t>SP</w:t>
       </w:r>
       <w:r>
         <w:rPr>
-          <w:sz w:val="20"/>
-          <w:szCs w:val="20"/>
+          <w:sz w:val="18"/>
+          <w:szCs w:val="18"/>
         </w:rPr>
         <w:t xml:space="preserve"> </w:t>
       </w:r>
       <w:r>
         <w:rPr>
-          <w:sz w:val="20"/>
-          <w:szCs w:val="20"/>
+          <w:sz w:val="18"/>
+          <w:szCs w:val="18"/>
         </w:rPr>
         <w:t>ministrando aulas de Java com foco em Programação Orientada a Objetos (POO) e boas práticas. Adaptei conteúdos a diferentes níveis de conhecimento, acompanhei o progresso dos alunos e promovi um ambiente inclusivo e motivador de aprendizagem.</w:t>
       </w:r>
@@ -584,21 +667,21 @@
         </w:numPr>
         <w:jc w:val="both"/>
         <w:rPr>
-          <w:sz w:val="20"/>
-          <w:szCs w:val="20"/>
-        </w:rPr>
-      </w:pPr>
-      <w:r>
-        <w:rPr>
-          <w:sz w:val="20"/>
-          <w:szCs w:val="20"/>
+          <w:sz w:val="18"/>
+          <w:szCs w:val="18"/>
+        </w:rPr>
+      </w:pPr>
+      <w:r>
+        <w:rPr>
+          <w:sz w:val="18"/>
+          <w:szCs w:val="18"/>
         </w:rPr>
         <w:t>Atuei como professor voluntário de Desenvolvimento Web</w:t>
       </w:r>
       <w:r>
         <w:rPr>
-          <w:sz w:val="20"/>
-          <w:szCs w:val="20"/>
+          <w:sz w:val="18"/>
+          <w:szCs w:val="18"/>
         </w:rPr>
         <w:t xml:space="preserve"> na </w:t>
       </w:r>
@@ -606,22 +689,22 @@
         <w:rPr>
           <w:b/>
           <w:bCs/>
-          <w:sz w:val="20"/>
-          <w:szCs w:val="20"/>
+          <w:sz w:val="18"/>
+          <w:szCs w:val="18"/>
         </w:rPr>
         <w:t>ESF</w:t>
       </w:r>
       <w:r>
         <w:rPr>
-          <w:sz w:val="20"/>
-          <w:szCs w:val="20"/>
+          <w:sz w:val="18"/>
+          <w:szCs w:val="18"/>
         </w:rPr>
         <w:t xml:space="preserve"> </w:t>
       </w:r>
       <w:r>
         <w:rPr>
-          <w:sz w:val="20"/>
-          <w:szCs w:val="20"/>
+          <w:sz w:val="18"/>
+          <w:szCs w:val="18"/>
         </w:rPr>
         <w:t xml:space="preserve">, ministrando aulas e colaborando na </w:t>
       </w:r>
@@ -629,15 +712,15 @@
         <w:rPr>
           <w:b/>
           <w:bCs/>
-          <w:sz w:val="20"/>
-          <w:szCs w:val="20"/>
+          <w:sz w:val="18"/>
+          <w:szCs w:val="18"/>
         </w:rPr>
         <w:t>gestão e adaptação de conteúdos didáticos</w:t>
       </w:r>
       <w:r>
         <w:rPr>
-          <w:sz w:val="20"/>
-          <w:szCs w:val="20"/>
+          <w:sz w:val="18"/>
+          <w:szCs w:val="18"/>
         </w:rPr>
         <w:t xml:space="preserve">, promovendo um ensino acessível e adequado aos </w:t>
       </w:r>
@@ -645,15 +728,15 @@
         <w:rPr>
           <w:b/>
           <w:bCs/>
-          <w:sz w:val="20"/>
-          <w:szCs w:val="20"/>
+          <w:sz w:val="18"/>
+          <w:szCs w:val="18"/>
         </w:rPr>
         <w:t>objetivos pedagógicos e ao perfil das turmas</w:t>
       </w:r>
       <w:r>
         <w:rPr>
-          <w:sz w:val="20"/>
-          <w:szCs w:val="20"/>
+          <w:sz w:val="18"/>
+          <w:szCs w:val="18"/>
         </w:rPr>
         <w:t>.</w:t>
       </w:r>
@@ -667,14 +750,14 @@
         </w:numPr>
         <w:jc w:val="both"/>
         <w:rPr>
-          <w:sz w:val="20"/>
-          <w:szCs w:val="20"/>
-        </w:rPr>
-      </w:pPr>
-      <w:r>
-        <w:rPr>
-          <w:sz w:val="20"/>
-          <w:szCs w:val="20"/>
+          <w:sz w:val="18"/>
+          <w:szCs w:val="18"/>
+        </w:rPr>
+      </w:pPr>
+      <w:r>
+        <w:rPr>
+          <w:sz w:val="18"/>
+          <w:szCs w:val="18"/>
         </w:rPr>
         <w:t xml:space="preserve">Na </w:t>
       </w:r>
@@ -682,15 +765,15 @@
         <w:rPr>
           <w:b/>
           <w:bCs/>
-          <w:sz w:val="20"/>
-          <w:szCs w:val="20"/>
+          <w:sz w:val="18"/>
+          <w:szCs w:val="18"/>
         </w:rPr>
         <w:t>Japan Society</w:t>
       </w:r>
       <w:r>
         <w:rPr>
-          <w:sz w:val="20"/>
-          <w:szCs w:val="20"/>
+          <w:sz w:val="18"/>
+          <w:szCs w:val="18"/>
         </w:rPr>
         <w:t>, automatizei o atendimento via WhatsApp com integração de respostas automáticas e desenvolvi planilhas em Excel para gestão de dados e análise de indicadores de performance, otimizando o suporte ao cliente e a tomada de decisões.</w:t>
       </w:r>
@@ -708,15 +791,15 @@
         <w:jc w:val="both"/>
         <w:rPr>
           <w:color w:val="000000"/>
-          <w:sz w:val="20"/>
-          <w:szCs w:val="20"/>
+          <w:sz w:val="18"/>
+          <w:szCs w:val="18"/>
         </w:rPr>
       </w:pPr>
       <w:r>
         <w:rPr>
           <w:color w:val="000000"/>
-          <w:sz w:val="20"/>
-          <w:szCs w:val="20"/>
+          <w:sz w:val="18"/>
+          <w:szCs w:val="18"/>
         </w:rPr>
         <w:t xml:space="preserve">Busco oportunidades em </w:t>
       </w:r>
@@ -725,16 +808,16 @@
           <w:b/>
           <w:bCs/>
           <w:color w:val="000000"/>
-          <w:sz w:val="20"/>
-          <w:szCs w:val="20"/>
+          <w:sz w:val="18"/>
+          <w:szCs w:val="18"/>
         </w:rPr>
         <w:t>Gestão de Projetos (PMO)</w:t>
       </w:r>
       <w:r>
         <w:rPr>
           <w:color w:val="000000"/>
-          <w:sz w:val="20"/>
-          <w:szCs w:val="20"/>
+          <w:sz w:val="18"/>
+          <w:szCs w:val="18"/>
         </w:rPr>
         <w:t xml:space="preserve">, </w:t>
       </w:r>
@@ -743,16 +826,16 @@
           <w:b/>
           <w:bCs/>
           <w:color w:val="000000"/>
-          <w:sz w:val="20"/>
-          <w:szCs w:val="20"/>
+          <w:sz w:val="18"/>
+          <w:szCs w:val="18"/>
         </w:rPr>
         <w:t>Análise de Dados</w:t>
       </w:r>
       <w:r>
         <w:rPr>
           <w:color w:val="000000"/>
-          <w:sz w:val="20"/>
-          <w:szCs w:val="20"/>
+          <w:sz w:val="18"/>
+          <w:szCs w:val="18"/>
         </w:rPr>
         <w:t xml:space="preserve"> ou </w:t>
       </w:r>
@@ -761,26 +844,16 @@
           <w:b/>
           <w:bCs/>
           <w:color w:val="000000"/>
-          <w:sz w:val="20"/>
-          <w:szCs w:val="20"/>
-        </w:rPr>
-        <w:t xml:space="preserve">Desenvolvimento </w:t>
-      </w:r>
-      <w:r>
-        <w:rPr>
-          <w:b/>
-          <w:bCs/>
+          <w:sz w:val="18"/>
+          <w:szCs w:val="18"/>
+        </w:rPr>
+        <w:t>Desenvolvimento WEB</w:t>
+      </w:r>
+      <w:r>
+        <w:rPr>
           <w:color w:val="000000"/>
-          <w:sz w:val="20"/>
-          <w:szCs w:val="20"/>
-        </w:rPr>
-        <w:t>WEB</w:t>
-      </w:r>
-      <w:r>
-        <w:rPr>
-          <w:color w:val="000000"/>
-          <w:sz w:val="20"/>
-          <w:szCs w:val="20"/>
+          <w:sz w:val="18"/>
+          <w:szCs w:val="18"/>
         </w:rPr>
         <w:t>, onde possa aplicar minha visão analítica para liderar iniciativas de alto impacto, otimizar processos e garantir entregas eficientes baseadas em evidências.</w:t>
       </w:r>
@@ -798,8 +871,8 @@
         <w:jc w:val="both"/>
         <w:rPr>
           <w:color w:val="000000"/>
-          <w:sz w:val="20"/>
-          <w:szCs w:val="20"/>
+          <w:sz w:val="18"/>
+          <w:szCs w:val="18"/>
           <w:lang w:val="pt-BR"/>
         </w:rPr>
       </w:pPr>
@@ -819,8 +892,8 @@
           <w:b/>
           <w:bCs/>
           <w:color w:val="000000"/>
-          <w:sz w:val="20"/>
-          <w:szCs w:val="20"/>
+          <w:sz w:val="18"/>
+          <w:szCs w:val="18"/>
         </w:rPr>
       </w:pPr>
       <w:r>
@@ -828,8 +901,8 @@
           <w:b/>
           <w:bCs/>
           <w:color w:val="000000"/>
-          <w:sz w:val="20"/>
-          <w:szCs w:val="20"/>
+          <w:sz w:val="18"/>
+          <w:szCs w:val="18"/>
         </w:rPr>
         <w:t>EXPERIÊNCIA PROFISSIONAL</w:t>
       </w:r>
@@ -849,8 +922,8 @@
           <w:b/>
           <w:bCs/>
           <w:color w:val="000000"/>
-          <w:sz w:val="20"/>
-          <w:szCs w:val="20"/>
+          <w:sz w:val="18"/>
+          <w:szCs w:val="18"/>
         </w:rPr>
       </w:pPr>
     </w:p>
@@ -869,8 +942,8 @@
           <w:b/>
           <w:bCs/>
           <w:color w:val="000000"/>
-          <w:sz w:val="20"/>
-          <w:szCs w:val="20"/>
+          <w:sz w:val="18"/>
+          <w:szCs w:val="18"/>
         </w:rPr>
       </w:pPr>
       <w:r>
@@ -878,8 +951,8 @@
           <w:b/>
           <w:bCs/>
           <w:color w:val="000000"/>
-          <w:sz w:val="20"/>
-          <w:szCs w:val="20"/>
+          <w:sz w:val="18"/>
+          <w:szCs w:val="18"/>
         </w:rPr>
         <w:t xml:space="preserve">INSTITUTO PRESBITERIANO MACKENZIE </w:t>
       </w:r>
@@ -899,8 +972,8 @@
           <w:b/>
           <w:bCs/>
           <w:color w:val="000000"/>
-          <w:sz w:val="20"/>
-          <w:szCs w:val="20"/>
+          <w:sz w:val="18"/>
+          <w:szCs w:val="18"/>
         </w:rPr>
       </w:pPr>
       <w:r>
@@ -908,8 +981,8 @@
           <w:b/>
           <w:bCs/>
           <w:color w:val="000000"/>
-          <w:sz w:val="20"/>
-          <w:szCs w:val="20"/>
+          <w:sz w:val="18"/>
+          <w:szCs w:val="18"/>
         </w:rPr>
         <w:t xml:space="preserve">Cientista de Dados </w:t>
       </w:r>
@@ -917,27 +990,18 @@
         <w:rPr>
           <w:b/>
           <w:bCs/>
-          <w:sz w:val="20"/>
-          <w:szCs w:val="20"/>
-        </w:rPr>
-        <w:t>-</w:t>
-      </w:r>
-      <w:r>
-        <w:rPr>
-          <w:b/>
-          <w:bCs/>
-          <w:sz w:val="20"/>
-          <w:szCs w:val="20"/>
-        </w:rPr>
-        <w:t xml:space="preserve"> </w:t>
+          <w:sz w:val="18"/>
+          <w:szCs w:val="18"/>
+        </w:rPr>
+        <w:t xml:space="preserve">- </w:t>
       </w:r>
       <w:r>
         <w:rPr>
           <w:b/>
           <w:bCs/>
           <w:color w:val="000000"/>
-          <w:sz w:val="20"/>
-          <w:szCs w:val="20"/>
+          <w:sz w:val="18"/>
+          <w:szCs w:val="18"/>
         </w:rPr>
         <w:t>Tempo Integral (2026)</w:t>
       </w:r>
@@ -962,8 +1026,8 @@
           <w:b/>
           <w:bCs/>
           <w:color w:val="000000"/>
-          <w:sz w:val="20"/>
-          <w:szCs w:val="20"/>
+          <w:sz w:val="18"/>
+          <w:szCs w:val="18"/>
         </w:rPr>
       </w:pPr>
       <w:r>
@@ -971,8 +1035,8 @@
           <w:b/>
           <w:bCs/>
           <w:color w:val="000000"/>
-          <w:sz w:val="20"/>
-          <w:szCs w:val="20"/>
+          <w:sz w:val="18"/>
+          <w:szCs w:val="18"/>
         </w:rPr>
         <w:t xml:space="preserve">Atuação estratégica na coordenação de atividades do curso de Medicina, focada na aplicação de inteligência de dados para suporte à gestão acadêmica. </w:t>
       </w:r>
@@ -997,8 +1061,8 @@
           <w:b/>
           <w:bCs/>
           <w:color w:val="000000"/>
-          <w:sz w:val="20"/>
-          <w:szCs w:val="20"/>
+          <w:sz w:val="18"/>
+          <w:szCs w:val="18"/>
         </w:rPr>
       </w:pPr>
       <w:r>
@@ -1006,8 +1070,8 @@
           <w:b/>
           <w:bCs/>
           <w:color w:val="000000"/>
-          <w:sz w:val="20"/>
-          <w:szCs w:val="20"/>
+          <w:sz w:val="18"/>
+          <w:szCs w:val="18"/>
         </w:rPr>
         <w:t xml:space="preserve">Business Intelligence (BI): Desenvolvimento e manutenção de dashboards de indicadores (NPS) para a coordenação do Curso de Medicina. </w:t>
       </w:r>
@@ -1032,8 +1096,8 @@
           <w:b/>
           <w:bCs/>
           <w:color w:val="000000"/>
-          <w:sz w:val="20"/>
-          <w:szCs w:val="20"/>
+          <w:sz w:val="18"/>
+          <w:szCs w:val="18"/>
         </w:rPr>
       </w:pPr>
       <w:r>
@@ -1041,8 +1105,8 @@
           <w:b/>
           <w:bCs/>
           <w:color w:val="000000"/>
-          <w:sz w:val="20"/>
-          <w:szCs w:val="20"/>
+          <w:sz w:val="18"/>
+          <w:szCs w:val="18"/>
         </w:rPr>
         <w:t xml:space="preserve">Análise de Dados: Transformação de dados brutos em insights acionáveis utilizando Power BI, DAX e Python. </w:t>
       </w:r>
@@ -1067,8 +1131,8 @@
           <w:b/>
           <w:bCs/>
           <w:color w:val="000000"/>
-          <w:sz w:val="20"/>
-          <w:szCs w:val="20"/>
+          <w:sz w:val="18"/>
+          <w:szCs w:val="18"/>
         </w:rPr>
       </w:pPr>
       <w:r>
@@ -1076,8 +1140,8 @@
           <w:b/>
           <w:bCs/>
           <w:color w:val="000000"/>
-          <w:sz w:val="20"/>
-          <w:szCs w:val="20"/>
+          <w:sz w:val="18"/>
+          <w:szCs w:val="18"/>
         </w:rPr>
         <w:t xml:space="preserve">Automação e Gestão: Estruturação de planilhas e fluxos de trabalho para otimizar a coordenação de atividades e a coleta de feedbacks institucionais. </w:t>
       </w:r>
@@ -1102,8 +1166,8 @@
           <w:b/>
           <w:bCs/>
           <w:color w:val="000000"/>
-          <w:sz w:val="20"/>
-          <w:szCs w:val="20"/>
+          <w:sz w:val="18"/>
+          <w:szCs w:val="18"/>
         </w:rPr>
       </w:pPr>
       <w:r>
@@ -1111,8 +1175,8 @@
           <w:b/>
           <w:bCs/>
           <w:color w:val="000000"/>
-          <w:sz w:val="20"/>
-          <w:szCs w:val="20"/>
+          <w:sz w:val="18"/>
+          <w:szCs w:val="18"/>
         </w:rPr>
         <w:t>Suporte à Coordenação: Colaboração direta em projetos de inteligência voltados à melhoria contínua da experiência acadêmica no campus Alphaville (CCBS).</w:t>
       </w:r>
@@ -1132,8 +1196,8 @@
           <w:b/>
           <w:bCs/>
           <w:color w:val="000000"/>
-          <w:sz w:val="20"/>
-          <w:szCs w:val="20"/>
+          <w:sz w:val="18"/>
+          <w:szCs w:val="18"/>
         </w:rPr>
       </w:pPr>
     </w:p>
@@ -1152,8 +1216,8 @@
           <w:b/>
           <w:bCs/>
           <w:color w:val="000000"/>
-          <w:sz w:val="20"/>
-          <w:szCs w:val="20"/>
+          <w:sz w:val="18"/>
+          <w:szCs w:val="18"/>
         </w:rPr>
       </w:pPr>
       <w:r>
@@ -1161,8 +1225,8 @@
           <w:b/>
           <w:bCs/>
           <w:color w:val="000000"/>
-          <w:sz w:val="20"/>
-          <w:szCs w:val="20"/>
+          <w:sz w:val="18"/>
+          <w:szCs w:val="18"/>
         </w:rPr>
         <w:t>SENAC</w:t>
       </w:r>
@@ -1171,8 +1235,8 @@
           <w:b/>
           <w:bCs/>
           <w:color w:val="000000"/>
-          <w:sz w:val="20"/>
-          <w:szCs w:val="20"/>
+          <w:sz w:val="18"/>
+          <w:szCs w:val="18"/>
         </w:rPr>
         <w:t xml:space="preserve"> LAPA TITO - SENAC SP </w:t>
       </w:r>
@@ -1183,16 +1247,16 @@
         <w:rPr>
           <w:b/>
           <w:bCs/>
-          <w:sz w:val="20"/>
-          <w:szCs w:val="20"/>
-        </w:rPr>
-      </w:pPr>
-      <w:r>
-        <w:rPr>
-          <w:b/>
-          <w:bCs/>
-          <w:sz w:val="20"/>
-          <w:szCs w:val="20"/>
+          <w:sz w:val="18"/>
+          <w:szCs w:val="18"/>
+        </w:rPr>
+      </w:pPr>
+      <w:r>
+        <w:rPr>
+          <w:b/>
+          <w:bCs/>
+          <w:sz w:val="18"/>
+          <w:szCs w:val="18"/>
         </w:rPr>
         <w:t>D</w:t>
       </w:r>
@@ -1200,8 +1264,8 @@
         <w:rPr>
           <w:b/>
           <w:bCs/>
-          <w:sz w:val="20"/>
-          <w:szCs w:val="20"/>
+          <w:sz w:val="18"/>
+          <w:szCs w:val="18"/>
         </w:rPr>
         <w:t>ocente em Tecnologia</w:t>
       </w:r>
@@ -1209,8 +1273,8 @@
         <w:rPr>
           <w:b/>
           <w:bCs/>
-          <w:sz w:val="20"/>
-          <w:szCs w:val="20"/>
+          <w:sz w:val="18"/>
+          <w:szCs w:val="18"/>
         </w:rPr>
         <w:t xml:space="preserve"> da Informação</w:t>
       </w:r>
@@ -1218,8 +1282,8 @@
         <w:rPr>
           <w:b/>
           <w:bCs/>
-          <w:sz w:val="20"/>
-          <w:szCs w:val="20"/>
+          <w:sz w:val="18"/>
+          <w:szCs w:val="18"/>
         </w:rPr>
         <w:t xml:space="preserve"> </w:t>
       </w:r>
@@ -1227,8 +1291,8 @@
         <w:rPr>
           <w:b/>
           <w:bCs/>
-          <w:sz w:val="20"/>
-          <w:szCs w:val="20"/>
+          <w:sz w:val="18"/>
+          <w:szCs w:val="18"/>
         </w:rPr>
         <w:t>–</w:t>
       </w:r>
@@ -1236,8 +1300,8 @@
         <w:rPr>
           <w:b/>
           <w:bCs/>
-          <w:sz w:val="20"/>
-          <w:szCs w:val="20"/>
+          <w:sz w:val="18"/>
+          <w:szCs w:val="18"/>
         </w:rPr>
         <w:t xml:space="preserve"> </w:t>
       </w:r>
@@ -1245,8 +1309,8 @@
         <w:rPr>
           <w:b/>
           <w:bCs/>
-          <w:sz w:val="20"/>
-          <w:szCs w:val="20"/>
+          <w:sz w:val="18"/>
+          <w:szCs w:val="18"/>
         </w:rPr>
         <w:t xml:space="preserve">Temporário </w:t>
       </w:r>
@@ -1254,8 +1318,8 @@
         <w:rPr>
           <w:b/>
           <w:bCs/>
-          <w:sz w:val="20"/>
-          <w:szCs w:val="20"/>
+          <w:sz w:val="18"/>
+          <w:szCs w:val="18"/>
         </w:rPr>
         <w:t>(0</w:t>
       </w:r>
@@ -1263,8 +1327,8 @@
         <w:rPr>
           <w:b/>
           <w:bCs/>
-          <w:sz w:val="20"/>
-          <w:szCs w:val="20"/>
+          <w:sz w:val="18"/>
+          <w:szCs w:val="18"/>
         </w:rPr>
         <w:t>7</w:t>
       </w:r>
@@ -1272,8 +1336,8 @@
         <w:rPr>
           <w:b/>
           <w:bCs/>
-          <w:sz w:val="20"/>
-          <w:szCs w:val="20"/>
+          <w:sz w:val="18"/>
+          <w:szCs w:val="18"/>
         </w:rPr>
         <w:t>/2025)</w:t>
       </w:r>
@@ -1287,14 +1351,14 @@
         </w:numPr>
         <w:jc w:val="both"/>
         <w:rPr>
-          <w:sz w:val="20"/>
-          <w:szCs w:val="20"/>
-        </w:rPr>
-      </w:pPr>
-      <w:r>
-        <w:rPr>
-          <w:sz w:val="20"/>
-          <w:szCs w:val="20"/>
+          <w:sz w:val="18"/>
+          <w:szCs w:val="18"/>
+        </w:rPr>
+      </w:pPr>
+      <w:r>
+        <w:rPr>
+          <w:sz w:val="18"/>
+          <w:szCs w:val="18"/>
         </w:rPr>
         <w:t xml:space="preserve">Ministrei aulas teóricas e práticas de </w:t>
       </w:r>
@@ -1302,15 +1366,15 @@
         <w:rPr>
           <w:b/>
           <w:bCs/>
-          <w:sz w:val="20"/>
-          <w:szCs w:val="20"/>
+          <w:sz w:val="18"/>
+          <w:szCs w:val="18"/>
         </w:rPr>
         <w:t>Java</w:t>
       </w:r>
       <w:r>
         <w:rPr>
-          <w:sz w:val="20"/>
-          <w:szCs w:val="20"/>
+          <w:sz w:val="18"/>
+          <w:szCs w:val="18"/>
         </w:rPr>
         <w:t xml:space="preserve">, com foco em </w:t>
       </w:r>
@@ -1318,15 +1382,15 @@
         <w:rPr>
           <w:b/>
           <w:bCs/>
-          <w:sz w:val="20"/>
-          <w:szCs w:val="20"/>
+          <w:sz w:val="18"/>
+          <w:szCs w:val="18"/>
         </w:rPr>
         <w:t>Programação Orientada a Objetos (POO)</w:t>
       </w:r>
       <w:r>
         <w:rPr>
-          <w:sz w:val="20"/>
-          <w:szCs w:val="20"/>
+          <w:sz w:val="18"/>
+          <w:szCs w:val="18"/>
         </w:rPr>
         <w:t xml:space="preserve"> e aplicação de </w:t>
       </w:r>
@@ -1334,22 +1398,22 @@
         <w:rPr>
           <w:b/>
           <w:bCs/>
-          <w:sz w:val="20"/>
-          <w:szCs w:val="20"/>
+          <w:sz w:val="18"/>
+          <w:szCs w:val="18"/>
         </w:rPr>
         <w:t>boas práticas de desenvolvimento</w:t>
       </w:r>
       <w:r>
         <w:rPr>
-          <w:sz w:val="20"/>
-          <w:szCs w:val="20"/>
+          <w:sz w:val="18"/>
+          <w:szCs w:val="18"/>
         </w:rPr>
         <w:t>.</w:t>
       </w:r>
       <w:r>
         <w:rPr>
-          <w:sz w:val="20"/>
-          <w:szCs w:val="20"/>
+          <w:sz w:val="18"/>
+          <w:szCs w:val="18"/>
         </w:rPr>
         <w:t>.</w:t>
       </w:r>
@@ -1363,14 +1427,14 @@
         </w:numPr>
         <w:jc w:val="both"/>
         <w:rPr>
-          <w:sz w:val="20"/>
-          <w:szCs w:val="20"/>
-        </w:rPr>
-      </w:pPr>
-      <w:r>
-        <w:rPr>
-          <w:sz w:val="20"/>
-          <w:szCs w:val="20"/>
+          <w:sz w:val="18"/>
+          <w:szCs w:val="18"/>
+        </w:rPr>
+      </w:pPr>
+      <w:r>
+        <w:rPr>
+          <w:sz w:val="18"/>
+          <w:szCs w:val="18"/>
         </w:rPr>
         <w:t xml:space="preserve">Atuei de forma proativa e colaborativa na </w:t>
       </w:r>
@@ -1378,15 +1442,15 @@
         <w:rPr>
           <w:b/>
           <w:bCs/>
-          <w:sz w:val="20"/>
-          <w:szCs w:val="20"/>
+          <w:sz w:val="18"/>
+          <w:szCs w:val="18"/>
         </w:rPr>
         <w:t>resolução de dúvidas</w:t>
       </w:r>
       <w:r>
         <w:rPr>
-          <w:sz w:val="20"/>
-          <w:szCs w:val="20"/>
+          <w:sz w:val="18"/>
+          <w:szCs w:val="18"/>
         </w:rPr>
         <w:t>, incentivando o pensamento lógico e o protagonismo no processo de aprendizagem.</w:t>
       </w:r>
@@ -1400,14 +1464,14 @@
         </w:numPr>
         <w:jc w:val="both"/>
         <w:rPr>
-          <w:sz w:val="20"/>
-          <w:szCs w:val="20"/>
-        </w:rPr>
-      </w:pPr>
-      <w:r>
-        <w:rPr>
-          <w:sz w:val="20"/>
-          <w:szCs w:val="20"/>
+          <w:sz w:val="18"/>
+          <w:szCs w:val="18"/>
+        </w:rPr>
+      </w:pPr>
+      <w:r>
+        <w:rPr>
+          <w:sz w:val="18"/>
+          <w:szCs w:val="18"/>
         </w:rPr>
         <w:t xml:space="preserve">Acompanhei o desempenho dos alunos, oferecendo </w:t>
       </w:r>
@@ -1415,15 +1479,15 @@
         <w:rPr>
           <w:b/>
           <w:bCs/>
-          <w:sz w:val="20"/>
-          <w:szCs w:val="20"/>
+          <w:sz w:val="18"/>
+          <w:szCs w:val="18"/>
         </w:rPr>
         <w:t>suporte técnico e motivacional</w:t>
       </w:r>
       <w:r>
         <w:rPr>
-          <w:sz w:val="20"/>
-          <w:szCs w:val="20"/>
+          <w:sz w:val="18"/>
+          <w:szCs w:val="18"/>
         </w:rPr>
         <w:t>, com foco na evolução contínua.</w:t>
       </w:r>
@@ -1441,8 +1505,8 @@
         <w:jc w:val="both"/>
         <w:rPr>
           <w:color w:val="000000"/>
-          <w:sz w:val="20"/>
-          <w:szCs w:val="20"/>
+          <w:sz w:val="18"/>
+          <w:szCs w:val="18"/>
           <w:lang w:val="pt-BR"/>
         </w:rPr>
       </w:pPr>
@@ -1452,9 +1516,16 @@
         <w:pStyle w:val="Ttulo1"/>
         <w:ind w:left="0"/>
         <w:jc w:val="both"/>
-      </w:pPr>
-      <w:r>
-        <w:lastRenderedPageBreak/>
+        <w:rPr>
+          <w:sz w:val="18"/>
+          <w:szCs w:val="18"/>
+        </w:rPr>
+      </w:pPr>
+      <w:r>
+        <w:rPr>
+          <w:sz w:val="18"/>
+          <w:szCs w:val="18"/>
+        </w:rPr>
         <w:t xml:space="preserve">FORMAÇÃO ACADÊMICA | EDUCAÇÃO </w:t>
       </w:r>
     </w:p>
@@ -1467,37 +1538,16 @@
         </w:numPr>
         <w:jc w:val="both"/>
         <w:rPr>
-          <w:sz w:val="20"/>
-          <w:szCs w:val="20"/>
-        </w:rPr>
-      </w:pPr>
-      <w:r>
-        <w:rPr>
-          <w:sz w:val="20"/>
-          <w:szCs w:val="20"/>
-        </w:rPr>
-        <w:t>Pós-Graduação Lato Sensu em Inteligência Artificial e Data Science para Líderes</w:t>
-      </w:r>
-      <w:r>
-        <w:rPr>
-          <w:sz w:val="20"/>
-          <w:szCs w:val="20"/>
-        </w:rPr>
-        <w:t xml:space="preserve"> - </w:t>
-      </w:r>
-      <w:r>
-        <w:rPr>
-          <w:sz w:val="20"/>
-          <w:szCs w:val="20"/>
-        </w:rPr>
-        <w:t>Universidade Presbiteriana Mackenzie</w:t>
-      </w:r>
-      <w:r>
-        <w:rPr>
-          <w:sz w:val="20"/>
-          <w:szCs w:val="20"/>
-        </w:rPr>
-        <w:t xml:space="preserve"> (04/2027).</w:t>
+          <w:sz w:val="18"/>
+          <w:szCs w:val="18"/>
+        </w:rPr>
+      </w:pPr>
+      <w:r>
+        <w:rPr>
+          <w:sz w:val="18"/>
+          <w:szCs w:val="18"/>
+        </w:rPr>
+        <w:t>Pós-Graduação Lato Sensu em Inteligência Artificial e Data Science para Líderes - Universidade Presbiteriana Mackenzie (04/2027).</w:t>
       </w:r>
     </w:p>
     <w:p>
@@ -1509,14 +1559,14 @@
         </w:numPr>
         <w:jc w:val="both"/>
         <w:rPr>
-          <w:sz w:val="20"/>
-          <w:szCs w:val="20"/>
-        </w:rPr>
-      </w:pPr>
-      <w:r>
-        <w:rPr>
-          <w:sz w:val="20"/>
-          <w:szCs w:val="20"/>
+          <w:sz w:val="18"/>
+          <w:szCs w:val="18"/>
+        </w:rPr>
+      </w:pPr>
+      <w:r>
+        <w:rPr>
+          <w:sz w:val="18"/>
+          <w:szCs w:val="18"/>
         </w:rPr>
         <w:t>Técnico em Informática para Internet – SENAC (02/2026).</w:t>
       </w:r>
@@ -1530,35 +1580,35 @@
         </w:numPr>
         <w:jc w:val="both"/>
         <w:rPr>
-          <w:sz w:val="20"/>
-          <w:szCs w:val="20"/>
-        </w:rPr>
-      </w:pPr>
-      <w:r>
-        <w:rPr>
-          <w:sz w:val="20"/>
-          <w:szCs w:val="20"/>
+          <w:sz w:val="18"/>
+          <w:szCs w:val="18"/>
+        </w:rPr>
+      </w:pPr>
+      <w:r>
+        <w:rPr>
+          <w:sz w:val="18"/>
+          <w:szCs w:val="18"/>
         </w:rPr>
         <w:t xml:space="preserve">Graduação em </w:t>
       </w:r>
       <w:r>
         <w:rPr>
-          <w:sz w:val="20"/>
-          <w:szCs w:val="20"/>
+          <w:sz w:val="18"/>
+          <w:szCs w:val="18"/>
         </w:rPr>
         <w:t>Análise e Desenvolvimento de Sistemas – TI - Universidade Cidade de São Paulo</w:t>
       </w:r>
       <w:r>
         <w:rPr>
-          <w:sz w:val="20"/>
-          <w:szCs w:val="20"/>
+          <w:sz w:val="18"/>
+          <w:szCs w:val="18"/>
         </w:rPr>
         <w:t xml:space="preserve"> (06/2024)</w:t>
       </w:r>
       <w:r>
         <w:rPr>
-          <w:sz w:val="20"/>
-          <w:szCs w:val="20"/>
+          <w:sz w:val="18"/>
+          <w:szCs w:val="18"/>
         </w:rPr>
         <w:t>.</w:t>
       </w:r>
@@ -1568,6 +1618,10 @@
         <w:pStyle w:val="Ttulo1"/>
         <w:ind w:left="0"/>
         <w:jc w:val="both"/>
+        <w:rPr>
+          <w:sz w:val="18"/>
+          <w:szCs w:val="18"/>
+        </w:rPr>
       </w:pPr>
     </w:p>
     <w:p>
@@ -1575,8 +1629,16 @@
         <w:pStyle w:val="Ttulo1"/>
         <w:ind w:left="0"/>
         <w:jc w:val="both"/>
-      </w:pPr>
-      <w:r>
+        <w:rPr>
+          <w:sz w:val="18"/>
+          <w:szCs w:val="18"/>
+        </w:rPr>
+      </w:pPr>
+      <w:r>
+        <w:rPr>
+          <w:sz w:val="18"/>
+          <w:szCs w:val="18"/>
+        </w:rPr>
         <w:t>INFORMÁTICA | SISTEMA | FERRAMENTA</w:t>
       </w:r>
     </w:p>
@@ -1591,61 +1653,61 @@
         <w:rPr>
           <w:b w:val="0"/>
           <w:bCs/>
+          <w:sz w:val="18"/>
+          <w:szCs w:val="18"/>
         </w:rPr>
       </w:pPr>
       <w:r>
         <w:rPr>
           <w:b w:val="0"/>
           <w:bCs/>
-        </w:rPr>
-        <w:t xml:space="preserve">Metodologias Ágeis </w:t>
+          <w:sz w:val="18"/>
+          <w:szCs w:val="18"/>
+        </w:rPr>
+        <w:t>Metodologias Ágeis e diversas Ferramentas</w:t>
       </w:r>
       <w:r>
         <w:rPr>
           <w:b w:val="0"/>
           <w:bCs/>
-        </w:rPr>
-        <w:t>e diversas F</w:t>
+          <w:sz w:val="18"/>
+          <w:szCs w:val="18"/>
+        </w:rPr>
+        <w:t xml:space="preserve"> como</w:t>
       </w:r>
       <w:r>
         <w:rPr>
           <w:b w:val="0"/>
           <w:bCs/>
-        </w:rPr>
-        <w:t>erramentas</w:t>
+          <w:sz w:val="18"/>
+          <w:szCs w:val="18"/>
+        </w:rPr>
+        <w:t xml:space="preserve"> </w:t>
       </w:r>
       <w:r>
         <w:rPr>
           <w:b w:val="0"/>
           <w:bCs/>
-        </w:rPr>
-        <w:t xml:space="preserve"> como</w:t>
+          <w:sz w:val="18"/>
+          <w:szCs w:val="18"/>
+        </w:rPr>
+        <w:t xml:space="preserve">Pacote </w:t>
       </w:r>
       <w:r>
         <w:rPr>
           <w:b w:val="0"/>
           <w:bCs/>
-        </w:rPr>
-        <w:t xml:space="preserve"> </w:t>
+          <w:sz w:val="18"/>
+          <w:szCs w:val="18"/>
+        </w:rPr>
+        <w:t>O</w:t>
       </w:r>
       <w:r>
         <w:rPr>
           <w:b w:val="0"/>
           <w:bCs/>
-        </w:rPr>
-        <w:t xml:space="preserve">Pacote </w:t>
-      </w:r>
-      <w:r>
-        <w:rPr>
-          <w:b w:val="0"/>
-          <w:bCs/>
-        </w:rPr>
-        <w:t>O</w:t>
-      </w:r>
-      <w:r>
-        <w:rPr>
-          <w:b w:val="0"/>
-          <w:bCs/>
+          <w:sz w:val="18"/>
+          <w:szCs w:val="18"/>
         </w:rPr>
         <w:t>ffice intermediário.</w:t>
       </w:r>
@@ -1661,26 +1723,25 @@
         <w:rPr>
           <w:b w:val="0"/>
           <w:bCs/>
+          <w:sz w:val="18"/>
+          <w:szCs w:val="18"/>
         </w:rPr>
       </w:pPr>
       <w:r>
         <w:rPr>
           <w:b w:val="0"/>
           <w:bCs/>
-        </w:rPr>
-        <w:t>Eclipse</w:t>
+          <w:sz w:val="18"/>
+          <w:szCs w:val="18"/>
+        </w:rPr>
+        <w:t xml:space="preserve">Eclipse, </w:t>
       </w:r>
       <w:r>
         <w:rPr>
           <w:b w:val="0"/>
           <w:bCs/>
-        </w:rPr>
-        <w:t xml:space="preserve">, </w:t>
-      </w:r>
-      <w:r>
-        <w:rPr>
-          <w:b w:val="0"/>
-          <w:bCs/>
+          <w:sz w:val="18"/>
+          <w:szCs w:val="18"/>
         </w:rPr>
         <w:t xml:space="preserve">Java, em aplicações mobile, desenvolvidas em Android Studio. </w:t>
       </w:r>
@@ -1696,12 +1757,16 @@
         <w:rPr>
           <w:b w:val="0"/>
           <w:bCs/>
+          <w:sz w:val="18"/>
+          <w:szCs w:val="18"/>
         </w:rPr>
       </w:pPr>
       <w:r>
         <w:rPr>
           <w:b w:val="0"/>
           <w:bCs/>
+          <w:sz w:val="18"/>
+          <w:szCs w:val="18"/>
         </w:rPr>
         <w:t xml:space="preserve">HTML, CSS e JavaScript, em desenvolvimento WEB com responsividade. </w:t>
       </w:r>
@@ -1717,12 +1782,16 @@
         <w:rPr>
           <w:b w:val="0"/>
           <w:bCs/>
+          <w:sz w:val="18"/>
+          <w:szCs w:val="18"/>
         </w:rPr>
       </w:pPr>
       <w:r>
         <w:rPr>
           <w:b w:val="0"/>
           <w:bCs/>
+          <w:sz w:val="18"/>
+          <w:szCs w:val="18"/>
         </w:rPr>
         <w:t xml:space="preserve">SQL, </w:t>
       </w:r>
@@ -1730,6 +1799,8 @@
         <w:rPr>
           <w:b w:val="0"/>
           <w:bCs/>
+          <w:sz w:val="18"/>
+          <w:szCs w:val="18"/>
         </w:rPr>
         <w:t>A</w:t>
       </w:r>
@@ -1737,6 +1808,8 @@
         <w:rPr>
           <w:b w:val="0"/>
           <w:bCs/>
+          <w:sz w:val="18"/>
+          <w:szCs w:val="18"/>
         </w:rPr>
         <w:t>nálise de dados</w:t>
       </w:r>
@@ -1744,15 +1817,10 @@
         <w:rPr>
           <w:b w:val="0"/>
           <w:bCs/>
-        </w:rPr>
-        <w:t xml:space="preserve">, </w:t>
-      </w:r>
-      <w:r>
-        <w:rPr>
-          <w:b w:val="0"/>
-          <w:bCs/>
-        </w:rPr>
-        <w:t xml:space="preserve">Power BI e MySQL. </w:t>
+          <w:sz w:val="18"/>
+          <w:szCs w:val="18"/>
+        </w:rPr>
+        <w:t xml:space="preserve">, Power BI e MySQL. </w:t>
       </w:r>
     </w:p>
     <w:p>
@@ -1766,12 +1834,16 @@
         <w:rPr>
           <w:b w:val="0"/>
           <w:bCs/>
+          <w:sz w:val="18"/>
+          <w:szCs w:val="18"/>
         </w:rPr>
       </w:pPr>
       <w:r>
         <w:rPr>
           <w:b w:val="0"/>
           <w:bCs/>
+          <w:sz w:val="18"/>
+          <w:szCs w:val="18"/>
         </w:rPr>
         <w:t xml:space="preserve">VS Code, </w:t>
       </w:r>
@@ -1779,28 +1851,38 @@
         <w:rPr>
           <w:b w:val="0"/>
           <w:bCs/>
+          <w:sz w:val="18"/>
+          <w:szCs w:val="18"/>
         </w:rPr>
         <w:t xml:space="preserve">Git e Changelog. - Prototipação (Figma), Canvas e Photoshop. </w:t>
       </w:r>
     </w:p>
-    <w:p/>
-    <w:p>
-      <w:pPr>
-        <w:jc w:val="both"/>
-        <w:rPr>
-          <w:b/>
-          <w:bCs/>
-          <w:sz w:val="20"/>
-          <w:szCs w:val="20"/>
-        </w:rPr>
-      </w:pPr>
-      <w:r>
-        <w:rPr>
-          <w:b/>
-          <w:bCs/>
-          <w:sz w:val="20"/>
-          <w:szCs w:val="20"/>
-        </w:rPr>
+    <w:p>
+      <w:pPr>
+        <w:rPr>
+          <w:sz w:val="18"/>
+          <w:szCs w:val="18"/>
+        </w:rPr>
+      </w:pPr>
+    </w:p>
+    <w:p>
+      <w:pPr>
+        <w:jc w:val="both"/>
+        <w:rPr>
+          <w:b/>
+          <w:bCs/>
+          <w:sz w:val="18"/>
+          <w:szCs w:val="18"/>
+        </w:rPr>
+      </w:pPr>
+      <w:r>
+        <w:rPr>
+          <w:b/>
+          <w:bCs/>
+          <w:sz w:val="18"/>
+          <w:szCs w:val="18"/>
+        </w:rPr>
+        <w:lastRenderedPageBreak/>
         <w:t>TRABALHO VOLUNTÁRIO</w:t>
       </w:r>
     </w:p>
@@ -1808,27 +1890,27 @@
       <w:pPr>
         <w:jc w:val="both"/>
         <w:rPr>
-          <w:sz w:val="20"/>
-          <w:szCs w:val="20"/>
-        </w:rPr>
-      </w:pPr>
-    </w:p>
-    <w:p>
-      <w:pPr>
-        <w:jc w:val="both"/>
-        <w:rPr>
-          <w:b/>
-          <w:bCs/>
-          <w:sz w:val="20"/>
-          <w:szCs w:val="20"/>
-        </w:rPr>
-      </w:pPr>
-      <w:r>
-        <w:rPr>
-          <w:b/>
-          <w:bCs/>
-          <w:sz w:val="20"/>
-          <w:szCs w:val="20"/>
+          <w:sz w:val="18"/>
+          <w:szCs w:val="18"/>
+        </w:rPr>
+      </w:pPr>
+    </w:p>
+    <w:p>
+      <w:pPr>
+        <w:jc w:val="both"/>
+        <w:rPr>
+          <w:b/>
+          <w:bCs/>
+          <w:sz w:val="18"/>
+          <w:szCs w:val="18"/>
+        </w:rPr>
+      </w:pPr>
+      <w:r>
+        <w:rPr>
+          <w:b/>
+          <w:bCs/>
+          <w:sz w:val="18"/>
+          <w:szCs w:val="18"/>
         </w:rPr>
         <w:t xml:space="preserve">THE DEVELOPER'S CONFERENCE - TDC SP </w:t>
       </w:r>
@@ -1839,16 +1921,16 @@
         <w:rPr>
           <w:b/>
           <w:bCs/>
-          <w:sz w:val="20"/>
-          <w:szCs w:val="20"/>
-        </w:rPr>
-      </w:pPr>
-      <w:r>
-        <w:rPr>
-          <w:b/>
-          <w:bCs/>
-          <w:sz w:val="20"/>
-          <w:szCs w:val="20"/>
+          <w:sz w:val="18"/>
+          <w:szCs w:val="18"/>
+        </w:rPr>
+      </w:pPr>
+      <w:r>
+        <w:rPr>
+          <w:b/>
+          <w:bCs/>
+          <w:sz w:val="18"/>
+          <w:szCs w:val="18"/>
         </w:rPr>
         <w:t>Assistente de Hub de Carreiras - Voluntário (09/2024)</w:t>
       </w:r>
@@ -1862,37 +1944,16 @@
         </w:numPr>
         <w:jc w:val="both"/>
         <w:rPr>
-          <w:sz w:val="20"/>
-          <w:szCs w:val="20"/>
-        </w:rPr>
-      </w:pPr>
-      <w:r>
-        <w:rPr>
-          <w:sz w:val="20"/>
-          <w:szCs w:val="20"/>
-        </w:rPr>
-        <w:t>S</w:t>
-      </w:r>
-      <w:r>
-        <w:rPr>
-          <w:sz w:val="20"/>
-          <w:szCs w:val="20"/>
-        </w:rPr>
-        <w:t>uporte no Hub de Carreiras durante o evento</w:t>
-      </w:r>
-      <w:r>
-        <w:rPr>
-          <w:sz w:val="20"/>
-          <w:szCs w:val="20"/>
-        </w:rPr>
-        <w:t xml:space="preserve"> de tecnologia</w:t>
-      </w:r>
-      <w:r>
-        <w:rPr>
-          <w:sz w:val="20"/>
-          <w:szCs w:val="20"/>
-        </w:rPr>
-        <w:t>, auxiliando coordenadores, palestrantes e congressistas.</w:t>
+          <w:sz w:val="18"/>
+          <w:szCs w:val="18"/>
+        </w:rPr>
+      </w:pPr>
+      <w:r>
+        <w:rPr>
+          <w:sz w:val="18"/>
+          <w:szCs w:val="18"/>
+        </w:rPr>
+        <w:t>Suporte no Hub de Carreiras durante o evento de tecnologia, auxiliando coordenadores, palestrantes e congressistas.</w:t>
       </w:r>
     </w:p>
     <w:p>
@@ -1904,14 +1965,14 @@
         </w:numPr>
         <w:jc w:val="both"/>
         <w:rPr>
-          <w:sz w:val="20"/>
-          <w:szCs w:val="20"/>
-        </w:rPr>
-      </w:pPr>
-      <w:r>
-        <w:rPr>
-          <w:sz w:val="20"/>
-          <w:szCs w:val="20"/>
+          <w:sz w:val="18"/>
+          <w:szCs w:val="18"/>
+        </w:rPr>
+      </w:pPr>
+      <w:r>
+        <w:rPr>
+          <w:sz w:val="18"/>
+          <w:szCs w:val="18"/>
         </w:rPr>
         <w:t>Acompanhamento das atividades da sala, garantindo a organização e o cumprimento da programação.</w:t>
       </w:r>
@@ -1922,27 +1983,27 @@
         <w:rPr>
           <w:b/>
           <w:bCs/>
-          <w:sz w:val="20"/>
-          <w:szCs w:val="20"/>
-        </w:rPr>
-      </w:pPr>
-    </w:p>
-    <w:p>
-      <w:pPr>
-        <w:jc w:val="both"/>
-        <w:rPr>
-          <w:b/>
-          <w:bCs/>
-          <w:sz w:val="20"/>
-          <w:szCs w:val="20"/>
-        </w:rPr>
-      </w:pPr>
-      <w:r>
-        <w:rPr>
-          <w:b/>
-          <w:bCs/>
-          <w:sz w:val="20"/>
-          <w:szCs w:val="20"/>
+          <w:sz w:val="18"/>
+          <w:szCs w:val="18"/>
+        </w:rPr>
+      </w:pPr>
+    </w:p>
+    <w:p>
+      <w:pPr>
+        <w:jc w:val="both"/>
+        <w:rPr>
+          <w:b/>
+          <w:bCs/>
+          <w:sz w:val="18"/>
+          <w:szCs w:val="18"/>
+        </w:rPr>
+      </w:pPr>
+      <w:r>
+        <w:rPr>
+          <w:b/>
+          <w:bCs/>
+          <w:sz w:val="18"/>
+          <w:szCs w:val="18"/>
         </w:rPr>
         <w:t>EDUCAÇÃO SEM FRONTEIRAS - ESF</w:t>
       </w:r>
@@ -1953,16 +2014,16 @@
         <w:rPr>
           <w:b/>
           <w:bCs/>
-          <w:sz w:val="20"/>
-          <w:szCs w:val="20"/>
-        </w:rPr>
-      </w:pPr>
-      <w:r>
-        <w:rPr>
-          <w:b/>
-          <w:bCs/>
-          <w:sz w:val="20"/>
-          <w:szCs w:val="20"/>
+          <w:sz w:val="18"/>
+          <w:szCs w:val="18"/>
+        </w:rPr>
+      </w:pPr>
+      <w:r>
+        <w:rPr>
+          <w:b/>
+          <w:bCs/>
+          <w:sz w:val="18"/>
+          <w:szCs w:val="18"/>
         </w:rPr>
         <w:t xml:space="preserve">Docente </w:t>
       </w:r>
@@ -1970,8 +2031,8 @@
         <w:rPr>
           <w:b/>
           <w:bCs/>
-          <w:sz w:val="20"/>
-          <w:szCs w:val="20"/>
+          <w:sz w:val="18"/>
+          <w:szCs w:val="18"/>
         </w:rPr>
         <w:t xml:space="preserve">de </w:t>
       </w:r>
@@ -1979,8 +2040,8 @@
         <w:rPr>
           <w:b/>
           <w:bCs/>
-          <w:sz w:val="20"/>
-          <w:szCs w:val="20"/>
+          <w:sz w:val="18"/>
+          <w:szCs w:val="18"/>
         </w:rPr>
         <w:t xml:space="preserve">informática para Internet </w:t>
       </w:r>
@@ -1988,8 +2049,8 @@
         <w:rPr>
           <w:b/>
           <w:bCs/>
-          <w:sz w:val="20"/>
-          <w:szCs w:val="20"/>
+          <w:sz w:val="18"/>
+          <w:szCs w:val="18"/>
         </w:rPr>
         <w:t>em Desenvolvimento Web  - Voluntário (04/2025)</w:t>
       </w:r>
@@ -2003,14 +2064,14 @@
         </w:numPr>
         <w:jc w:val="both"/>
         <w:rPr>
-          <w:sz w:val="20"/>
-          <w:szCs w:val="20"/>
-        </w:rPr>
-      </w:pPr>
-      <w:r>
-        <w:rPr>
-          <w:sz w:val="20"/>
-          <w:szCs w:val="20"/>
+          <w:sz w:val="18"/>
+          <w:szCs w:val="18"/>
+        </w:rPr>
+      </w:pPr>
+      <w:r>
+        <w:rPr>
+          <w:sz w:val="18"/>
+          <w:szCs w:val="18"/>
         </w:rPr>
         <w:t>Ministrar aulas sobre diversas tecnologias, incluindo gestão de projetos, programação e outras tecnologias.</w:t>
       </w:r>
@@ -2024,28 +2085,28 @@
         </w:numPr>
         <w:jc w:val="both"/>
         <w:rPr>
-          <w:sz w:val="20"/>
-          <w:szCs w:val="20"/>
-        </w:rPr>
-      </w:pPr>
-      <w:r>
-        <w:rPr>
-          <w:sz w:val="20"/>
-          <w:szCs w:val="20"/>
+          <w:sz w:val="18"/>
+          <w:szCs w:val="18"/>
+        </w:rPr>
+      </w:pPr>
+      <w:r>
+        <w:rPr>
+          <w:sz w:val="18"/>
+          <w:szCs w:val="18"/>
         </w:rPr>
         <w:t>Adaptar o conteúdo das aulas para atender a diferentes níveis de conhecimento dos alunos</w:t>
       </w:r>
       <w:r>
         <w:rPr>
-          <w:sz w:val="20"/>
-          <w:szCs w:val="20"/>
+          <w:sz w:val="18"/>
+          <w:szCs w:val="18"/>
         </w:rPr>
         <w:t xml:space="preserve"> e d</w:t>
       </w:r>
       <w:r>
         <w:rPr>
-          <w:sz w:val="20"/>
-          <w:szCs w:val="20"/>
+          <w:sz w:val="18"/>
+          <w:szCs w:val="18"/>
         </w:rPr>
         <w:t>esenvolver metodologias de ensino acessíveis e dinâmicas.</w:t>
       </w:r>
@@ -2059,14 +2120,14 @@
         </w:numPr>
         <w:jc w:val="both"/>
         <w:rPr>
-          <w:sz w:val="20"/>
-          <w:szCs w:val="20"/>
-        </w:rPr>
-      </w:pPr>
-      <w:r>
-        <w:rPr>
-          <w:sz w:val="20"/>
-          <w:szCs w:val="20"/>
+          <w:sz w:val="18"/>
+          <w:szCs w:val="18"/>
+        </w:rPr>
+      </w:pPr>
+      <w:r>
+        <w:rPr>
+          <w:sz w:val="18"/>
+          <w:szCs w:val="18"/>
         </w:rPr>
         <w:t>Criar um ambiente de aprendizagem acolhedor e inclusivo, respeitando a diversidade cultural.</w:t>
       </w:r>
@@ -2076,6 +2137,10 @@
         <w:pStyle w:val="Ttulo1"/>
         <w:ind w:left="0"/>
         <w:jc w:val="both"/>
+        <w:rPr>
+          <w:sz w:val="18"/>
+          <w:szCs w:val="18"/>
+        </w:rPr>
       </w:pPr>
     </w:p>
     <w:p>
@@ -2083,8 +2148,16 @@
         <w:pStyle w:val="Ttulo1"/>
         <w:ind w:left="0"/>
         <w:jc w:val="both"/>
-      </w:pPr>
-      <w:r>
+        <w:rPr>
+          <w:sz w:val="18"/>
+          <w:szCs w:val="18"/>
+        </w:rPr>
+      </w:pPr>
+      <w:r>
+        <w:rPr>
+          <w:sz w:val="18"/>
+          <w:szCs w:val="18"/>
+        </w:rPr>
         <w:t>IDIOMA</w:t>
       </w:r>
     </w:p>
@@ -2097,21 +2170,21 @@
         </w:numPr>
         <w:jc w:val="both"/>
         <w:rPr>
-          <w:sz w:val="20"/>
-          <w:szCs w:val="20"/>
-        </w:rPr>
-      </w:pPr>
-      <w:r>
-        <w:rPr>
-          <w:sz w:val="20"/>
-          <w:szCs w:val="20"/>
+          <w:sz w:val="18"/>
+          <w:szCs w:val="18"/>
+        </w:rPr>
+      </w:pPr>
+      <w:r>
+        <w:rPr>
+          <w:sz w:val="18"/>
+          <w:szCs w:val="18"/>
         </w:rPr>
         <w:t xml:space="preserve">Inglês </w:t>
       </w:r>
       <w:r>
         <w:rPr>
-          <w:sz w:val="20"/>
-          <w:szCs w:val="20"/>
+          <w:sz w:val="18"/>
+          <w:szCs w:val="18"/>
         </w:rPr>
         <w:t>básico.</w:t>
       </w:r>
@@ -2122,8 +2195,8 @@
         <w:ind w:left="0"/>
         <w:jc w:val="both"/>
         <w:rPr>
-          <w:sz w:val="20"/>
-          <w:szCs w:val="20"/>
+          <w:sz w:val="18"/>
+          <w:szCs w:val="18"/>
         </w:rPr>
       </w:pPr>
     </w:p>
@@ -2131,8 +2204,16 @@
       <w:pPr>
         <w:pStyle w:val="Ttulo1"/>
         <w:ind w:left="0"/>
-      </w:pPr>
-      <w:r>
+        <w:rPr>
+          <w:sz w:val="18"/>
+          <w:szCs w:val="18"/>
+        </w:rPr>
+      </w:pPr>
+      <w:r>
+        <w:rPr>
+          <w:sz w:val="18"/>
+          <w:szCs w:val="18"/>
+        </w:rPr>
         <w:t>CURSO | CERTIFICAÇÃO</w:t>
       </w:r>
     </w:p>
@@ -2148,6 +2229,8 @@
           <w:b w:val="0"/>
           <w:bCs/>
           <w:color w:val="auto"/>
+          <w:sz w:val="18"/>
+          <w:szCs w:val="18"/>
           <w:u w:val="none"/>
         </w:rPr>
       </w:pPr>
@@ -2155,50 +2238,46 @@
         <w:rPr>
           <w:b w:val="0"/>
           <w:bCs/>
-        </w:rPr>
-        <w:t xml:space="preserve">Desenvolvedor </w:t>
+          <w:sz w:val="18"/>
+          <w:szCs w:val="18"/>
+        </w:rPr>
+        <w:t>Desenvolvedor Mobile (SENAC Lapa Tito) - 500h (09/2025).</w:t>
       </w:r>
       <w:r>
         <w:rPr>
           <w:b w:val="0"/>
           <w:bCs/>
-        </w:rPr>
-        <w:t xml:space="preserve">Mobile </w:t>
+          <w:sz w:val="18"/>
+          <w:szCs w:val="18"/>
+          <w:lang w:val="pt-BR"/>
+        </w:rPr>
+        <w:fldChar w:fldCharType="begin"/>
       </w:r>
       <w:r>
         <w:rPr>
           <w:b w:val="0"/>
           <w:bCs/>
-        </w:rPr>
-        <w:t>(SENAC Lapa Tito) - 500h (09/2025).</w:t>
+          <w:sz w:val="18"/>
+          <w:szCs w:val="18"/>
+          <w:lang w:val="pt-BR"/>
+        </w:rPr>
+        <w:instrText>HYPERLINK "https://github.com/minoru-yamanaka/cv/blob/main/certificados/ASSISTENTES_DE_PESQUISA_COM_GPTS_PERSONALIZADOS_NO_CHATGPT_E_NOTEBOOKLM.pdf" \t "_self"</w:instrText>
       </w:r>
       <w:r>
         <w:rPr>
           <w:b w:val="0"/>
           <w:bCs/>
+          <w:sz w:val="18"/>
+          <w:szCs w:val="18"/>
           <w:lang w:val="pt-BR"/>
         </w:rPr>
-        <w:fldChar w:fldCharType="begin"/>
       </w:r>
       <w:r>
         <w:rPr>
           <w:b w:val="0"/>
           <w:bCs/>
-          <w:lang w:val="pt-BR"/>
-        </w:rPr>
-        <w:instrText>HYPERLINK "https://github.com/minoru-yamanaka/cv/blob/main/certificados/ASSISTENTES_DE_PESQUISA_COM_GPTS_PERSONALIZADOS_NO_CHATGPT_E_NOTEBOOKLM.pdf" \t "_self"</w:instrText>
-      </w:r>
-      <w:r>
-        <w:rPr>
-          <w:b w:val="0"/>
-          <w:bCs/>
-          <w:lang w:val="pt-BR"/>
-        </w:rPr>
-      </w:r>
-      <w:r>
-        <w:rPr>
-          <w:b w:val="0"/>
-          <w:bCs/>
+          <w:sz w:val="18"/>
+          <w:szCs w:val="18"/>
           <w:lang w:val="pt-BR"/>
         </w:rPr>
         <w:fldChar w:fldCharType="separate"/>
@@ -2214,6 +2293,8 @@
         <w:rPr>
           <w:rStyle w:val="Hyperlink"/>
           <w:color w:val="auto"/>
+          <w:sz w:val="18"/>
+          <w:szCs w:val="18"/>
           <w:u w:val="none"/>
         </w:rPr>
       </w:pPr>
@@ -2222,8 +2303,8 @@
           <w:rStyle w:val="Hyperlink"/>
           <w:bCs/>
           <w:color w:val="auto"/>
-          <w:sz w:val="20"/>
-          <w:szCs w:val="20"/>
+          <w:sz w:val="18"/>
+          <w:szCs w:val="18"/>
           <w:u w:val="none"/>
           <w:lang w:val="pt-BR"/>
         </w:rPr>
@@ -2232,61 +2313,31 @@
       <w:r>
         <w:rPr>
           <w:bCs/>
-          <w:sz w:val="20"/>
-          <w:szCs w:val="20"/>
+          <w:sz w:val="18"/>
+          <w:szCs w:val="18"/>
         </w:rPr>
         <w:fldChar w:fldCharType="end"/>
       </w:r>
       <w:r>
         <w:rPr>
           <w:bCs/>
-          <w:sz w:val="20"/>
-          <w:szCs w:val="20"/>
-        </w:rPr>
-        <w:t xml:space="preserve"> Ativas</w:t>
-      </w:r>
-      <w:r>
-        <w:rPr>
-          <w:bCs/>
-        </w:rPr>
-        <w:t xml:space="preserve"> </w:t>
-      </w:r>
-      <w:r>
-        <w:t>(</w:t>
-      </w:r>
-      <w:r>
-        <w:rPr>
-          <w:sz w:val="20"/>
-          <w:szCs w:val="20"/>
-        </w:rPr>
-        <w:t>FGV</w:t>
-      </w:r>
-      <w:r>
-        <w:t xml:space="preserve">) - </w:t>
-      </w:r>
-      <w:r>
-        <w:t>1</w:t>
-      </w:r>
-      <w:r>
-        <w:t>h</w:t>
-      </w:r>
-      <w:r>
-        <w:t xml:space="preserve"> (01/</w:t>
-      </w:r>
-      <w:r>
-        <w:t>202</w:t>
-      </w:r>
-      <w:r>
-        <w:t>6)</w:t>
-      </w:r>
-      <w:r>
-        <w:t>.</w:t>
-      </w:r>
-      <w:r>
-        <w:rPr>
-          <w:bCs/>
-          <w:sz w:val="20"/>
-          <w:szCs w:val="20"/>
+          <w:sz w:val="18"/>
+          <w:szCs w:val="18"/>
+        </w:rPr>
+        <w:t xml:space="preserve"> Ativas </w:t>
+      </w:r>
+      <w:r>
+        <w:rPr>
+          <w:sz w:val="18"/>
+          <w:szCs w:val="18"/>
+        </w:rPr>
+        <w:t>(FGV) - 1h (01/2026).</w:t>
+      </w:r>
+      <w:r>
+        <w:rPr>
+          <w:bCs/>
+          <w:sz w:val="18"/>
+          <w:szCs w:val="18"/>
           <w:lang w:val="pt-BR"/>
         </w:rPr>
         <w:fldChar w:fldCharType="begin"/>
@@ -2294,6 +2345,8 @@
       <w:r>
         <w:rPr>
           <w:bCs/>
+          <w:sz w:val="18"/>
+          <w:szCs w:val="18"/>
           <w:lang w:val="pt-BR"/>
         </w:rPr>
         <w:instrText>HYPERLINK "https://github.com/minoru-yamanaka/cv/blob/main/certificados/ASSISTENTES_DE_PESQUISA_COM_GPTS_PERSONALIZADOS_NO_CHATGPT_E_NOTEBOOKLM.pdf" \t "_self"</w:instrText>
@@ -2301,16 +2354,16 @@
       <w:r>
         <w:rPr>
           <w:bCs/>
-          <w:sz w:val="20"/>
-          <w:szCs w:val="20"/>
+          <w:sz w:val="18"/>
+          <w:szCs w:val="18"/>
           <w:lang w:val="pt-BR"/>
         </w:rPr>
       </w:r>
       <w:r>
         <w:rPr>
           <w:bCs/>
-          <w:sz w:val="20"/>
-          <w:szCs w:val="20"/>
+          <w:sz w:val="18"/>
+          <w:szCs w:val="18"/>
           <w:lang w:val="pt-BR"/>
         </w:rPr>
         <w:fldChar w:fldCharType="separate"/>
@@ -2323,81 +2376,59 @@
           <w:ilvl w:val="0"/>
           <w:numId w:val="24"/>
         </w:numPr>
+        <w:rPr>
+          <w:sz w:val="18"/>
+          <w:szCs w:val="18"/>
+        </w:rPr>
       </w:pPr>
       <w:r>
         <w:rPr>
           <w:rStyle w:val="Hyperlink"/>
           <w:bCs/>
           <w:color w:val="auto"/>
-          <w:sz w:val="20"/>
-          <w:szCs w:val="20"/>
+          <w:sz w:val="18"/>
+          <w:szCs w:val="18"/>
           <w:u w:val="none"/>
           <w:lang w:val="pt-BR"/>
         </w:rPr>
-        <w:t>Criação de assistentes personalizados no ChatGPT e</w:t>
-      </w:r>
+        <w:t xml:space="preserve">Criação de assistentes personalizados no ChatGPT e </w:t>
+      </w:r>
+      <w:proofErr w:type="spellStart"/>
       <w:r>
         <w:rPr>
           <w:rStyle w:val="Hyperlink"/>
           <w:bCs/>
           <w:color w:val="auto"/>
-          <w:sz w:val="20"/>
-          <w:szCs w:val="20"/>
+          <w:sz w:val="18"/>
+          <w:szCs w:val="18"/>
           <w:u w:val="none"/>
           <w:lang w:val="pt-BR"/>
         </w:rPr>
+        <w:t>NotebookLM</w:t>
+      </w:r>
+      <w:proofErr w:type="spellEnd"/>
+      <w:r>
+        <w:rPr>
+          <w:bCs/>
+          <w:sz w:val="18"/>
+          <w:szCs w:val="18"/>
+        </w:rPr>
+        <w:fldChar w:fldCharType="end"/>
+      </w:r>
+      <w:r>
+        <w:rPr>
+          <w:bCs/>
+          <w:sz w:val="18"/>
+          <w:szCs w:val="18"/>
+        </w:rPr>
         <w:t xml:space="preserve"> </w:t>
       </w:r>
       <w:r>
         <w:rPr>
-          <w:rStyle w:val="Hyperlink"/>
-          <w:bCs/>
-          <w:color w:val="auto"/>
-          <w:sz w:val="20"/>
-          <w:szCs w:val="20"/>
-          <w:u w:val="none"/>
-          <w:lang w:val="pt-BR"/>
-        </w:rPr>
-        <w:t>NotebookLM</w:t>
-      </w:r>
-      <w:r>
-        <w:rPr>
-          <w:bCs/>
-        </w:rPr>
-        <w:fldChar w:fldCharType="end"/>
-      </w:r>
-      <w:r>
-        <w:rPr>
-          <w:bCs/>
-        </w:rPr>
-        <w:t xml:space="preserve"> </w:t>
-      </w:r>
-      <w:r>
-        <w:t>(</w:t>
-      </w:r>
-      <w:r>
-        <w:t>Mackenzie</w:t>
-      </w:r>
-      <w:r>
-        <w:t xml:space="preserve">) - </w:t>
-      </w:r>
-      <w:r>
-        <w:t>4</w:t>
-      </w:r>
-      <w:r>
-        <w:t>h</w:t>
-      </w:r>
-      <w:r>
-        <w:t xml:space="preserve"> (01/</w:t>
-      </w:r>
-      <w:r>
-        <w:t>202</w:t>
-      </w:r>
-      <w:r>
-        <w:t>6)</w:t>
-      </w:r>
-      <w:r>
-        <w:t>.</w:t>
+          <w:sz w:val="18"/>
+          <w:szCs w:val="18"/>
+        </w:rPr>
+        <w:t>(Mackenzie) - 4h (01/2026).</w:t>
       </w:r>
     </w:p>
     <w:p>
@@ -2409,72 +2440,16 @@
         </w:numPr>
         <w:jc w:val="both"/>
         <w:rPr>
-          <w:sz w:val="20"/>
-          <w:szCs w:val="20"/>
-        </w:rPr>
-      </w:pPr>
-      <w:r>
-        <w:rPr>
-          <w:sz w:val="20"/>
-          <w:szCs w:val="20"/>
-        </w:rPr>
-        <w:t xml:space="preserve">Desenvolvedor </w:t>
-      </w:r>
-      <w:r>
-        <w:rPr>
-          <w:sz w:val="20"/>
-          <w:szCs w:val="20"/>
-        </w:rPr>
-        <w:t>Back</w:t>
-      </w:r>
-      <w:r>
-        <w:rPr>
-          <w:sz w:val="20"/>
-          <w:szCs w:val="20"/>
-        </w:rPr>
-        <w:t xml:space="preserve">-End (SENAC Lapa Tito) - </w:t>
-      </w:r>
-      <w:r>
-        <w:rPr>
-          <w:sz w:val="20"/>
-          <w:szCs w:val="20"/>
-        </w:rPr>
-        <w:t>500</w:t>
-      </w:r>
-      <w:r>
-        <w:rPr>
-          <w:sz w:val="20"/>
-          <w:szCs w:val="20"/>
-        </w:rPr>
-        <w:t>h</w:t>
-      </w:r>
-      <w:r>
-        <w:rPr>
-          <w:sz w:val="20"/>
-          <w:szCs w:val="20"/>
-        </w:rPr>
-        <w:t xml:space="preserve"> (09/</w:t>
-      </w:r>
-      <w:r>
-        <w:rPr>
-          <w:sz w:val="20"/>
-          <w:szCs w:val="20"/>
-        </w:rPr>
-        <w:t>2025</w:t>
-      </w:r>
-      <w:r>
-        <w:rPr>
-          <w:sz w:val="20"/>
-          <w:szCs w:val="20"/>
-        </w:rPr>
-        <w:t>)</w:t>
-      </w:r>
-      <w:r>
-        <w:rPr>
-          <w:sz w:val="20"/>
-          <w:szCs w:val="20"/>
-        </w:rPr>
-        <w:t>.</w:t>
+          <w:sz w:val="18"/>
+          <w:szCs w:val="18"/>
+        </w:rPr>
+      </w:pPr>
+      <w:r>
+        <w:rPr>
+          <w:sz w:val="18"/>
+          <w:szCs w:val="18"/>
+        </w:rPr>
+        <w:t>Desenvolvedor Back-End (SENAC Lapa Tito) - 500h (09/2025).</w:t>
       </w:r>
     </w:p>
     <w:p>
@@ -2486,42 +2461,28 @@
         </w:numPr>
         <w:jc w:val="both"/>
         <w:rPr>
-          <w:sz w:val="20"/>
-          <w:szCs w:val="20"/>
-        </w:rPr>
-      </w:pPr>
-      <w:r>
-        <w:rPr>
-          <w:sz w:val="20"/>
-          <w:szCs w:val="20"/>
+          <w:sz w:val="18"/>
+          <w:szCs w:val="18"/>
+        </w:rPr>
+      </w:pPr>
+      <w:r>
+        <w:rPr>
+          <w:sz w:val="18"/>
+          <w:szCs w:val="18"/>
         </w:rPr>
         <w:t>Desenvolvedor Front-End (SENAC Lapa Tito) - 264h</w:t>
       </w:r>
       <w:r>
         <w:rPr>
-          <w:sz w:val="20"/>
-          <w:szCs w:val="20"/>
-        </w:rPr>
-        <w:t xml:space="preserve"> (06/</w:t>
-      </w:r>
-      <w:r>
-        <w:rPr>
-          <w:sz w:val="20"/>
-          <w:szCs w:val="20"/>
-        </w:rPr>
-        <w:t>2025</w:t>
-      </w:r>
-      <w:r>
-        <w:rPr>
-          <w:sz w:val="20"/>
-          <w:szCs w:val="20"/>
-        </w:rPr>
-        <w:t>)</w:t>
-      </w:r>
-      <w:r>
-        <w:rPr>
-          <w:sz w:val="20"/>
-          <w:szCs w:val="20"/>
+          <w:sz w:val="18"/>
+          <w:szCs w:val="18"/>
+        </w:rPr>
+        <w:t xml:space="preserve"> (06/2025)</w:t>
+      </w:r>
+      <w:r>
+        <w:rPr>
+          <w:sz w:val="18"/>
+          <w:szCs w:val="18"/>
         </w:rPr>
         <w:t>.</w:t>
       </w:r>
@@ -2535,14 +2496,14 @@
         </w:numPr>
         <w:jc w:val="both"/>
         <w:rPr>
-          <w:sz w:val="20"/>
-          <w:szCs w:val="20"/>
-        </w:rPr>
-      </w:pPr>
-      <w:r>
-        <w:rPr>
-          <w:sz w:val="20"/>
-          <w:szCs w:val="20"/>
+          <w:sz w:val="18"/>
+          <w:szCs w:val="18"/>
+        </w:rPr>
+      </w:pPr>
+      <w:r>
+        <w:rPr>
+          <w:sz w:val="18"/>
+          <w:szCs w:val="18"/>
         </w:rPr>
         <w:t>Banco de Dados para Data Science (SENAI Nadir Dias de Figueiredo) - 40h (09/2024)</w:t>
       </w:r>
@@ -2556,14 +2517,14 @@
         </w:numPr>
         <w:jc w:val="both"/>
         <w:rPr>
-          <w:sz w:val="20"/>
-          <w:szCs w:val="20"/>
-        </w:rPr>
-      </w:pPr>
-      <w:r>
-        <w:rPr>
-          <w:sz w:val="20"/>
-          <w:szCs w:val="20"/>
+          <w:sz w:val="18"/>
+          <w:szCs w:val="18"/>
+        </w:rPr>
+      </w:pPr>
+      <w:r>
+        <w:rPr>
+          <w:sz w:val="18"/>
+          <w:szCs w:val="18"/>
         </w:rPr>
         <w:t>Microsoft Office Excel (SENAI Nadir Dias de Figueiredo) – 20h (08/2024)</w:t>
       </w:r>
@@ -2577,14 +2538,14 @@
         </w:numPr>
         <w:jc w:val="both"/>
         <w:rPr>
-          <w:sz w:val="20"/>
-          <w:szCs w:val="20"/>
-        </w:rPr>
-      </w:pPr>
-      <w:r>
-        <w:rPr>
-          <w:sz w:val="20"/>
-          <w:szCs w:val="20"/>
+          <w:sz w:val="18"/>
+          <w:szCs w:val="18"/>
+        </w:rPr>
+      </w:pPr>
+      <w:r>
+        <w:rPr>
+          <w:sz w:val="18"/>
+          <w:szCs w:val="18"/>
         </w:rPr>
         <w:t>Implementação em Big Data (SENAI Roberto Simonsen) - 40h (08/2024)</w:t>
       </w:r>
@@ -2598,14 +2559,14 @@
         </w:numPr>
         <w:jc w:val="both"/>
         <w:rPr>
-          <w:sz w:val="20"/>
-          <w:szCs w:val="20"/>
-        </w:rPr>
-      </w:pPr>
-      <w:r>
-        <w:rPr>
-          <w:sz w:val="20"/>
-          <w:szCs w:val="20"/>
+          <w:sz w:val="18"/>
+          <w:szCs w:val="18"/>
+        </w:rPr>
+      </w:pPr>
+      <w:r>
+        <w:rPr>
+          <w:sz w:val="18"/>
+          <w:szCs w:val="18"/>
         </w:rPr>
         <w:t>Programação em Python para Data Science (SENAI Ary Torres) - 60h (08/2024)</w:t>
       </w:r>
@@ -2619,14 +2580,14 @@
         </w:numPr>
         <w:jc w:val="both"/>
         <w:rPr>
-          <w:sz w:val="20"/>
-          <w:szCs w:val="20"/>
-        </w:rPr>
-      </w:pPr>
-      <w:r>
-        <w:rPr>
-          <w:sz w:val="20"/>
-          <w:szCs w:val="20"/>
+          <w:sz w:val="18"/>
+          <w:szCs w:val="18"/>
+        </w:rPr>
+      </w:pPr>
+      <w:r>
+        <w:rPr>
+          <w:sz w:val="18"/>
+          <w:szCs w:val="18"/>
         </w:rPr>
         <w:t>Design Centrado no Usuário (PUCRS) - 10h (07/2024)</w:t>
       </w:r>
@@ -2640,14 +2601,14 @@
         </w:numPr>
         <w:jc w:val="both"/>
         <w:rPr>
-          <w:sz w:val="20"/>
-          <w:szCs w:val="20"/>
-        </w:rPr>
-      </w:pPr>
-      <w:r>
-        <w:rPr>
-          <w:sz w:val="20"/>
-          <w:szCs w:val="20"/>
+          <w:sz w:val="18"/>
+          <w:szCs w:val="18"/>
+        </w:rPr>
+      </w:pPr>
+      <w:r>
+        <w:rPr>
+          <w:sz w:val="18"/>
+          <w:szCs w:val="18"/>
         </w:rPr>
         <w:t>Compliance e Proteção de Dados (PUCRS) - 10h (07/2024)</w:t>
       </w:r>
@@ -2661,14 +2622,14 @@
         </w:numPr>
         <w:jc w:val="both"/>
         <w:rPr>
-          <w:sz w:val="20"/>
-          <w:szCs w:val="20"/>
-        </w:rPr>
-      </w:pPr>
-      <w:r>
-        <w:rPr>
-          <w:sz w:val="20"/>
-          <w:szCs w:val="20"/>
+          <w:sz w:val="18"/>
+          <w:szCs w:val="18"/>
+        </w:rPr>
+      </w:pPr>
+      <w:r>
+        <w:rPr>
+          <w:sz w:val="18"/>
+          <w:szCs w:val="18"/>
         </w:rPr>
         <w:t>Soluções Ágeis (SEBRAE) - 24h (07/2024)</w:t>
       </w:r>
@@ -2682,14 +2643,14 @@
         </w:numPr>
         <w:jc w:val="both"/>
         <w:rPr>
-          <w:sz w:val="20"/>
-          <w:szCs w:val="20"/>
-        </w:rPr>
-      </w:pPr>
-      <w:r>
-        <w:rPr>
-          <w:sz w:val="20"/>
-          <w:szCs w:val="20"/>
+          <w:sz w:val="18"/>
+          <w:szCs w:val="18"/>
+        </w:rPr>
+      </w:pPr>
+      <w:r>
+        <w:rPr>
+          <w:sz w:val="18"/>
+          <w:szCs w:val="18"/>
         </w:rPr>
         <w:t>Gestão de Recursos Humanos (SEBRAE) - 15h (07/2024)</w:t>
       </w:r>
@@ -2703,14 +2664,14 @@
         </w:numPr>
         <w:jc w:val="both"/>
         <w:rPr>
-          <w:sz w:val="20"/>
-          <w:szCs w:val="20"/>
-        </w:rPr>
-      </w:pPr>
-      <w:r>
-        <w:rPr>
-          <w:sz w:val="20"/>
-          <w:szCs w:val="20"/>
+          <w:sz w:val="18"/>
+          <w:szCs w:val="18"/>
+        </w:rPr>
+      </w:pPr>
+      <w:r>
+        <w:rPr>
+          <w:sz w:val="18"/>
+          <w:szCs w:val="18"/>
         </w:rPr>
         <w:t>Introdução à Ciência de Dados (FGV) - 60h (07/2024)</w:t>
       </w:r>
@@ -2724,14 +2685,14 @@
         </w:numPr>
         <w:jc w:val="both"/>
         <w:rPr>
-          <w:sz w:val="20"/>
-          <w:szCs w:val="20"/>
-        </w:rPr>
-      </w:pPr>
-      <w:r>
-        <w:rPr>
-          <w:sz w:val="20"/>
-          <w:szCs w:val="20"/>
+          <w:sz w:val="18"/>
+          <w:szCs w:val="18"/>
+        </w:rPr>
+      </w:pPr>
+      <w:r>
+        <w:rPr>
+          <w:sz w:val="18"/>
+          <w:szCs w:val="18"/>
         </w:rPr>
         <w:t>Power BI (SENAI Orlando Laviero Ferraiuolo) - 20h (06/2024)</w:t>
       </w:r>
@@ -2745,14 +2706,14 @@
         </w:numPr>
         <w:jc w:val="both"/>
         <w:rPr>
-          <w:sz w:val="20"/>
-          <w:szCs w:val="20"/>
-        </w:rPr>
-      </w:pPr>
-      <w:r>
-        <w:rPr>
-          <w:sz w:val="20"/>
-          <w:szCs w:val="20"/>
+          <w:sz w:val="18"/>
+          <w:szCs w:val="18"/>
+        </w:rPr>
+      </w:pPr>
+      <w:r>
+        <w:rPr>
+          <w:sz w:val="18"/>
+          <w:szCs w:val="18"/>
         </w:rPr>
         <w:t>Programação em Python (SENAI José Ephim Mindlin) - 120h (04/2024)</w:t>
       </w:r>
@@ -2766,14 +2727,14 @@
         </w:numPr>
         <w:jc w:val="both"/>
         <w:rPr>
-          <w:sz w:val="20"/>
-          <w:szCs w:val="20"/>
-        </w:rPr>
-      </w:pPr>
-      <w:r>
-        <w:rPr>
-          <w:sz w:val="20"/>
-          <w:szCs w:val="20"/>
+          <w:sz w:val="18"/>
+          <w:szCs w:val="18"/>
+        </w:rPr>
+      </w:pPr>
+      <w:r>
+        <w:rPr>
+          <w:sz w:val="18"/>
+          <w:szCs w:val="18"/>
         </w:rPr>
         <w:t>Web Design, Front End (SENAI Roberto Simonsen) - 180h (04/2024)</w:t>
       </w:r>
@@ -2787,14 +2748,14 @@
         </w:numPr>
         <w:jc w:val="both"/>
         <w:rPr>
-          <w:sz w:val="20"/>
-          <w:szCs w:val="20"/>
-        </w:rPr>
-      </w:pPr>
-      <w:r>
-        <w:rPr>
-          <w:sz w:val="20"/>
-          <w:szCs w:val="20"/>
+          <w:sz w:val="18"/>
+          <w:szCs w:val="18"/>
+        </w:rPr>
+      </w:pPr>
+      <w:r>
+        <w:rPr>
+          <w:sz w:val="18"/>
+          <w:szCs w:val="18"/>
         </w:rPr>
         <w:t>Programação Oracle, Java Foundations (SENAI Mariano Ferraz) - 120h (12/2023)</w:t>
       </w:r>
@@ -2808,14 +2769,14 @@
         </w:numPr>
         <w:jc w:val="both"/>
         <w:rPr>
-          <w:sz w:val="20"/>
-          <w:szCs w:val="20"/>
-        </w:rPr>
-      </w:pPr>
-      <w:r>
-        <w:rPr>
-          <w:sz w:val="20"/>
-          <w:szCs w:val="20"/>
+          <w:sz w:val="18"/>
+          <w:szCs w:val="18"/>
+        </w:rPr>
+      </w:pPr>
+      <w:r>
+        <w:rPr>
+          <w:sz w:val="18"/>
+          <w:szCs w:val="18"/>
         </w:rPr>
         <w:t>Desenvolvedor de Aplicações para Android (SENAI Mariano Ferraz) - 40h (12/2023)</w:t>
       </w:r>
@@ -2829,14 +2790,14 @@
         </w:numPr>
         <w:jc w:val="both"/>
         <w:rPr>
-          <w:sz w:val="20"/>
-          <w:szCs w:val="20"/>
-        </w:rPr>
-      </w:pPr>
-      <w:r>
-        <w:rPr>
-          <w:sz w:val="20"/>
-          <w:szCs w:val="20"/>
+          <w:sz w:val="18"/>
+          <w:szCs w:val="18"/>
+        </w:rPr>
+      </w:pPr>
+      <w:r>
+        <w:rPr>
+          <w:sz w:val="18"/>
+          <w:szCs w:val="18"/>
         </w:rPr>
         <w:t>Java Foundations - 120h (12/2023)</w:t>
       </w:r>
@@ -2850,14 +2811,14 @@
         </w:numPr>
         <w:jc w:val="both"/>
         <w:rPr>
-          <w:sz w:val="20"/>
-          <w:szCs w:val="20"/>
-        </w:rPr>
-      </w:pPr>
-      <w:r>
-        <w:rPr>
-          <w:sz w:val="20"/>
-          <w:szCs w:val="20"/>
+          <w:sz w:val="18"/>
+          <w:szCs w:val="18"/>
+        </w:rPr>
+      </w:pPr>
+      <w:r>
+        <w:rPr>
+          <w:sz w:val="18"/>
+          <w:szCs w:val="18"/>
         </w:rPr>
         <w:t>Microsoft Power BI (Fundação Bradesco) - 5h (05/2023)</w:t>
       </w:r>
@@ -2871,14 +2832,14 @@
         </w:numPr>
         <w:jc w:val="both"/>
         <w:rPr>
-          <w:sz w:val="20"/>
-          <w:szCs w:val="20"/>
-        </w:rPr>
-      </w:pPr>
-      <w:r>
-        <w:rPr>
-          <w:sz w:val="20"/>
-          <w:szCs w:val="20"/>
+          <w:sz w:val="18"/>
+          <w:szCs w:val="18"/>
+        </w:rPr>
+      </w:pPr>
+      <w:r>
+        <w:rPr>
+          <w:sz w:val="18"/>
+          <w:szCs w:val="18"/>
         </w:rPr>
         <w:t>Google Fundamentos do Marketing Digital (Google) - 40h (04/2023)</w:t>
       </w:r>
@@ -2892,14 +2853,14 @@
         </w:numPr>
         <w:jc w:val="both"/>
         <w:rPr>
-          <w:sz w:val="20"/>
-          <w:szCs w:val="20"/>
-        </w:rPr>
-      </w:pPr>
-      <w:r>
-        <w:rPr>
-          <w:sz w:val="20"/>
-          <w:szCs w:val="20"/>
+          <w:sz w:val="18"/>
+          <w:szCs w:val="18"/>
+        </w:rPr>
+      </w:pPr>
+      <w:r>
+        <w:rPr>
+          <w:sz w:val="18"/>
+          <w:szCs w:val="18"/>
         </w:rPr>
         <w:t>Projetos de Sistemas de TI (Fundação Bradesco) - 15h (03/2023)</w:t>
       </w:r>
@@ -2913,14 +2874,14 @@
         </w:numPr>
         <w:jc w:val="both"/>
         <w:rPr>
-          <w:sz w:val="20"/>
-          <w:szCs w:val="20"/>
-        </w:rPr>
-      </w:pPr>
-      <w:r>
-        <w:rPr>
-          <w:sz w:val="20"/>
-          <w:szCs w:val="20"/>
+          <w:sz w:val="18"/>
+          <w:szCs w:val="18"/>
+        </w:rPr>
+      </w:pPr>
+      <w:r>
+        <w:rPr>
+          <w:sz w:val="18"/>
+          <w:szCs w:val="18"/>
         </w:rPr>
         <w:t>Inglês Instrumental - Universidade Cidade de São Paulo - 80h (12/2022)</w:t>
       </w:r>
@@ -2934,14 +2895,14 @@
         </w:numPr>
         <w:jc w:val="both"/>
         <w:rPr>
-          <w:sz w:val="20"/>
-          <w:szCs w:val="20"/>
-        </w:rPr>
-      </w:pPr>
-      <w:r>
-        <w:rPr>
-          <w:sz w:val="20"/>
-          <w:szCs w:val="20"/>
+          <w:sz w:val="18"/>
+          <w:szCs w:val="18"/>
+        </w:rPr>
+      </w:pPr>
+      <w:r>
+        <w:rPr>
+          <w:sz w:val="18"/>
+          <w:szCs w:val="18"/>
         </w:rPr>
         <w:t>Gestão de Tecnologia da Informação - Universidade Cidade de São Paulo - 60h (07/2023)</w:t>
       </w:r>
@@ -2955,14 +2916,14 @@
         </w:numPr>
         <w:jc w:val="both"/>
         <w:rPr>
-          <w:sz w:val="20"/>
-          <w:szCs w:val="20"/>
-        </w:rPr>
-      </w:pPr>
-      <w:r>
-        <w:rPr>
-          <w:sz w:val="20"/>
-          <w:szCs w:val="20"/>
+          <w:sz w:val="18"/>
+          <w:szCs w:val="18"/>
+        </w:rPr>
+      </w:pPr>
+      <w:r>
+        <w:rPr>
+          <w:sz w:val="18"/>
+          <w:szCs w:val="18"/>
         </w:rPr>
         <w:t>Governança Corporativa - Universidade Cidade de São Paulo - 60h (07/2023)</w:t>
       </w:r>
@@ -2976,16 +2937,25 @@
         </w:numPr>
         <w:jc w:val="both"/>
         <w:rPr>
-          <w:sz w:val="20"/>
-          <w:szCs w:val="20"/>
-        </w:rPr>
-      </w:pPr>
-      <w:r>
-        <w:rPr>
-          <w:sz w:val="20"/>
-          <w:szCs w:val="20"/>
-        </w:rPr>
-        <w:t>Java · Devmedia (09/2022)</w:t>
+          <w:color w:val="000000" w:themeColor="text1"/>
+          <w:sz w:val="18"/>
+          <w:szCs w:val="18"/>
+        </w:rPr>
+      </w:pPr>
+      <w:r>
+        <w:rPr>
+          <w:sz w:val="18"/>
+          <w:szCs w:val="18"/>
+        </w:rPr>
+        <w:t>Java · Devmedia (09/20</w:t>
+      </w:r>
+      <w:r>
+        <w:rPr>
+          <w:color w:val="000000" w:themeColor="text1"/>
+          <w:sz w:val="18"/>
+          <w:szCs w:val="18"/>
+        </w:rPr>
+        <w:t>22)</w:t>
       </w:r>
     </w:p>
     <w:p>
@@ -2997,16 +2967,65 @@
         </w:numPr>
         <w:jc w:val="both"/>
         <w:rPr>
-          <w:sz w:val="20"/>
-          <w:szCs w:val="20"/>
-        </w:rPr>
-      </w:pPr>
-      <w:r>
-        <w:rPr>
-          <w:sz w:val="20"/>
-          <w:szCs w:val="20"/>
-        </w:rPr>
-        <w:t>Programação – Devmedia (06/2022)</w:t>
+          <w:color w:val="000000" w:themeColor="text1"/>
+          <w:sz w:val="18"/>
+          <w:szCs w:val="18"/>
+        </w:rPr>
+      </w:pPr>
+      <w:r>
+        <w:rPr>
+          <w:color w:val="000000" w:themeColor="text1"/>
+          <w:sz w:val="18"/>
+          <w:szCs w:val="18"/>
+        </w:rPr>
+        <w:t>Programação</w:t>
+      </w:r>
+      <w:r>
+        <w:rPr>
+          <w:color w:val="000000" w:themeColor="text1"/>
+          <w:sz w:val="18"/>
+          <w:szCs w:val="18"/>
+        </w:rPr>
+        <w:t xml:space="preserve">, </w:t>
+      </w:r>
+      <w:r>
+        <w:rPr>
+          <w:color w:val="000000" w:themeColor="text1"/>
+          <w:sz w:val="18"/>
+          <w:szCs w:val="18"/>
+        </w:rPr>
+        <w:t>HTML</w:t>
+      </w:r>
+      <w:r>
+        <w:rPr>
+          <w:color w:val="000000" w:themeColor="text1"/>
+          <w:sz w:val="18"/>
+          <w:szCs w:val="18"/>
+        </w:rPr>
+        <w:t xml:space="preserve">  e </w:t>
+      </w:r>
+      <w:r>
+        <w:rPr>
+          <w:color w:val="000000" w:themeColor="text1"/>
+          <w:sz w:val="18"/>
+          <w:szCs w:val="18"/>
+        </w:rPr>
+        <w:t>CSS</w:t>
+      </w:r>
+      <w:r>
+        <w:rPr>
+          <w:color w:val="000000" w:themeColor="text1"/>
+          <w:sz w:val="18"/>
+          <w:szCs w:val="18"/>
+        </w:rPr>
+        <w:t xml:space="preserve"> </w:t>
+      </w:r>
+      <w:r>
+        <w:rPr>
+          <w:sz w:val="18"/>
+          <w:szCs w:val="18"/>
+        </w:rPr>
+        <w:t>- Devmedia (06/2022)</w:t>
       </w:r>
     </w:p>
     <w:p>
@@ -3018,76 +3037,21 @@
         </w:numPr>
         <w:jc w:val="both"/>
         <w:rPr>
-          <w:sz w:val="20"/>
-          <w:szCs w:val="20"/>
-        </w:rPr>
-      </w:pPr>
-      <w:r>
-        <w:rPr>
-          <w:sz w:val="20"/>
-          <w:szCs w:val="20"/>
-        </w:rPr>
-        <w:t>CSS - Devmedia (06/2022)</w:t>
-      </w:r>
-    </w:p>
-    <w:p>
-      <w:pPr>
-        <w:pStyle w:val="PargrafodaLista"/>
-        <w:numPr>
-          <w:ilvl w:val="0"/>
-          <w:numId w:val="24"/>
-        </w:numPr>
-        <w:jc w:val="both"/>
-        <w:rPr>
-          <w:sz w:val="20"/>
-          <w:szCs w:val="20"/>
-        </w:rPr>
-      </w:pPr>
-      <w:r>
-        <w:rPr>
-          <w:sz w:val="20"/>
-          <w:szCs w:val="20"/>
-        </w:rPr>
-        <w:t>HTML - Devmedia (06/2022)</w:t>
-      </w:r>
-      <w:r>
-        <w:rPr>
-          <w:color w:val="FFFFFF" w:themeColor="background1"/>
-          <w:sz w:val="20"/>
-          <w:szCs w:val="20"/>
-        </w:rPr>
-        <w:t xml:space="preserve">comunicação e negociação.om tendências do setor de TI. </w:t>
-      </w:r>
-    </w:p>
-    <w:p>
-      <w:pPr>
-        <w:pStyle w:val="PargrafodaLista"/>
-        <w:jc w:val="both"/>
-        <w:rPr>
-          <w:color w:val="FFFFFF" w:themeColor="background1"/>
-          <w:sz w:val="20"/>
-          <w:szCs w:val="20"/>
-        </w:rPr>
-      </w:pPr>
-      <w:r>
-        <w:rPr>
-          <w:color w:val="FFFFFF" w:themeColor="background1"/>
-          <w:sz w:val="20"/>
-          <w:szCs w:val="20"/>
-        </w:rPr>
-        <w:t>Certificações em RH ou headhu</w:t>
-      </w:r>
-      <w:r>
-        <w:rPr>
-          <w:color w:val="FFFFFF" w:themeColor="background1"/>
-          <w:sz w:val="20"/>
-          <w:szCs w:val="20"/>
-        </w:rPr>
-        <w:t xml:space="preserve"> metodologias ágeis</w:t>
+          <w:sz w:val="18"/>
+          <w:szCs w:val="18"/>
+        </w:rPr>
+      </w:pPr>
+      <w:r>
+        <w:rPr>
+          <w:color w:val="000000" w:themeColor="text1"/>
+          <w:sz w:val="18"/>
+          <w:szCs w:val="18"/>
+        </w:rPr>
+        <w:t>Acessibilidade e Equidade na Educação com IA - Ensino Einstein (09/2026)</w:t>
       </w:r>
     </w:p>
     <w:sectPr>
-      <w:headerReference w:type="default" r:id="rId11"/>
+      <w:headerReference w:type="default" r:id="rId9"/>
       <w:pgSz w:w="11910" w:h="16840"/>
       <w:pgMar w:top="720" w:right="720" w:bottom="720" w:left="720" w:header="0" w:footer="726" w:gutter="0"/>
       <w:pgNumType w:start="1"/>
@@ -7386,7 +7350,6 @@
   <w:style w:type="character" w:default="1" w:styleId="Fontepargpadro">
     <w:name w:val="Default Paragraph Font"/>
     <w:uiPriority w:val="1"/>
-    <w:semiHidden/>
     <w:unhideWhenUsed/>
   </w:style>
   <w:style w:type="table" w:default="1" w:styleId="Tabelanormal">

</xml_diff>